<commit_message>
Literature + IPAC v1 v2
</commit_message>
<xml_diff>
--- a/PREDAC/ReseachProposal MachineLearning AbhishekHupele.docx
+++ b/PREDAC/ReseachProposal MachineLearning AbhishekHupele.docx
@@ -1,6 +1,6 @@
 
 <file path=word/document.xml><?xml version="1.0" encoding="utf-8"?>
-<w:document xmlns:wpc="http://schemas.microsoft.com/office/word/2010/wordprocessingCanvas" xmlns:cx="http://schemas.microsoft.com/office/drawing/2014/chartex" xmlns:cx1="http://schemas.microsoft.com/office/drawing/2015/9/8/chartex" xmlns:cx2="http://schemas.microsoft.com/office/drawing/2015/10/21/chartex" xmlns:cx3="http://schemas.microsoft.com/office/drawing/2016/5/9/chartex" xmlns:cx4="http://schemas.microsoft.com/office/drawing/2016/5/10/chartex" xmlns:cx5="http://schemas.microsoft.com/office/drawing/2016/5/11/chartex" xmlns:cx6="http://schemas.microsoft.com/office/drawing/2016/5/12/chartex" xmlns:cx7="http://schemas.microsoft.com/office/drawing/2016/5/13/chartex" xmlns:cx8="http://schemas.microsoft.com/office/drawing/2016/5/14/chartex" xmlns:mc="http://schemas.openxmlformats.org/markup-compatibility/2006" xmlns:aink="http://schemas.microsoft.com/office/drawing/2016/ink" xmlns:am3d="http://schemas.microsoft.com/office/drawing/2017/model3d" xmlns:o="urn:schemas-microsoft-com:office:office" xmlns:oel="http://schemas.microsoft.com/office/2019/extlst" xmlns:r="http://schemas.openxmlformats.org/officeDocument/2006/relationships" xmlns:m="http://schemas.openxmlformats.org/officeDocument/2006/math" xmlns:v="urn:schemas-microsoft-com:vml" xmlns:wp14="http://schemas.microsoft.com/office/word/2010/wordprocessingDrawing" xmlns:wp="http://schemas.openxmlformats.org/drawingml/2006/wordprocessingDrawing" xmlns:w10="urn:schemas-microsoft-com:office:word" xmlns:w="http://schemas.openxmlformats.org/wordprocessingml/2006/main" xmlns:w14="http://schemas.microsoft.com/office/word/2010/wordml" xmlns:w15="http://schemas.microsoft.com/office/word/2012/wordml" xmlns:w16cex="http://schemas.microsoft.com/office/word/2018/wordml/cex" xmlns:w16cid="http://schemas.microsoft.com/office/word/2016/wordml/cid" xmlns:w16="http://schemas.microsoft.com/office/word/2018/wordml" xmlns:w16sdtdh="http://schemas.microsoft.com/office/word/2020/wordml/sdtdatahash" xmlns:w16se="http://schemas.microsoft.com/office/word/2015/wordml/symex" xmlns:wpg="http://schemas.microsoft.com/office/word/2010/wordprocessingGroup" xmlns:wpi="http://schemas.microsoft.com/office/word/2010/wordprocessingInk" xmlns:wne="http://schemas.microsoft.com/office/word/2006/wordml" xmlns:wps="http://schemas.microsoft.com/office/word/2010/wordprocessingShape" mc:Ignorable="w14 w15 w16se w16cid w16 w16cex w16sdtdh wp14">
+<w:document xmlns:wpc="http://schemas.microsoft.com/office/word/2010/wordprocessingCanvas" xmlns:cx="http://schemas.microsoft.com/office/drawing/2014/chartex" xmlns:cx1="http://schemas.microsoft.com/office/drawing/2015/9/8/chartex" xmlns:cx2="http://schemas.microsoft.com/office/drawing/2015/10/21/chartex" xmlns:cx3="http://schemas.microsoft.com/office/drawing/2016/5/9/chartex" xmlns:cx4="http://schemas.microsoft.com/office/drawing/2016/5/10/chartex" xmlns:cx5="http://schemas.microsoft.com/office/drawing/2016/5/11/chartex" xmlns:cx6="http://schemas.microsoft.com/office/drawing/2016/5/12/chartex" xmlns:cx7="http://schemas.microsoft.com/office/drawing/2016/5/13/chartex" xmlns:cx8="http://schemas.microsoft.com/office/drawing/2016/5/14/chartex" xmlns:mc="http://schemas.openxmlformats.org/markup-compatibility/2006" xmlns:aink="http://schemas.microsoft.com/office/drawing/2016/ink" xmlns:am3d="http://schemas.microsoft.com/office/drawing/2017/model3d" xmlns:o="urn:schemas-microsoft-com:office:office" xmlns:oel="http://schemas.microsoft.com/office/2019/extlst" xmlns:r="http://schemas.openxmlformats.org/officeDocument/2006/relationships" xmlns:m="http://schemas.openxmlformats.org/officeDocument/2006/math" xmlns:v="urn:schemas-microsoft-com:vml" xmlns:wp14="http://schemas.microsoft.com/office/word/2010/wordprocessingDrawing" xmlns:wp="http://schemas.openxmlformats.org/drawingml/2006/wordprocessingDrawing" xmlns:w10="urn:schemas-microsoft-com:office:word" xmlns:w="http://schemas.openxmlformats.org/wordprocessingml/2006/main" xmlns:w14="http://schemas.microsoft.com/office/word/2010/wordml" xmlns:w15="http://schemas.microsoft.com/office/word/2012/wordml" xmlns:w16cex="http://schemas.microsoft.com/office/word/2018/wordml/cex" xmlns:w16cid="http://schemas.microsoft.com/office/word/2016/wordml/cid" xmlns:w16="http://schemas.microsoft.com/office/word/2018/wordml" xmlns:w16du="http://schemas.microsoft.com/office/word/2023/wordml/word16du" xmlns:w16sdtdh="http://schemas.microsoft.com/office/word/2020/wordml/sdtdatahash" xmlns:w16sdtfl="http://schemas.microsoft.com/office/word/2024/wordml/sdtformatlock" xmlns:w16se="http://schemas.microsoft.com/office/word/2015/wordml/symex" xmlns:wpg="http://schemas.microsoft.com/office/word/2010/wordprocessingGroup" xmlns:wpi="http://schemas.microsoft.com/office/word/2010/wordprocessingInk" xmlns:wne="http://schemas.microsoft.com/office/word/2006/wordml" xmlns:wps="http://schemas.microsoft.com/office/word/2010/wordprocessingShape" mc:Ignorable="w14 w15 w16se w16cid w16 w16cex w16sdtdh w16sdtfl w16du wp14">
   <w:body>
     <w:p>
       <w:pPr>
@@ -10730,8 +10730,7 @@
     </w:sdt>
     <w:p>
       <w:pPr>
-        <w:pStyle w:val="Title"/>
-        <w:jc w:val="center"/>
+        <w:pStyle w:val="Heading1"/>
       </w:pPr>
       <w:bookmarkStart w:id="0" w:name="_Toc206437384"/>
       <w:r>
@@ -11344,15 +11343,7 @@
         <w:jc w:val="both"/>
       </w:pPr>
       <w:r>
-        <w:t xml:space="preserve">Second, the paper by </w:t>
-      </w:r>
-      <w:proofErr w:type="spellStart"/>
-      <w:r>
-        <w:t>Xueqin</w:t>
-      </w:r>
-      <w:proofErr w:type="spellEnd"/>
-      <w:r>
-        <w:t xml:space="preserve"> Liang et al. on "Investigating the adoption of hybrid encrypted cloud data deduplication with game theory" will be analyzed. The focus here will be on the </w:t>
+        <w:t xml:space="preserve">Second, the paper by Xueqin Liang et al. on "Investigating the adoption of hybrid encrypted cloud data deduplication with game theory" will be analyzed. The focus here will be on the </w:t>
       </w:r>
       <w:r>
         <w:rPr>
@@ -13939,15 +13930,7 @@
         <w:t>Vulnerability Identification:</w:t>
       </w:r>
       <w:r>
-        <w:t xml:space="preserve"> A theoretical explanation for why certain existing unlearning methods </w:t>
-      </w:r>
-      <w:proofErr w:type="gramStart"/>
-      <w:r>
-        <w:t>are</w:t>
-      </w:r>
-      <w:proofErr w:type="gramEnd"/>
-      <w:r>
-        <w:t xml:space="preserve"> susceptible to knowledge recovery or performance degradation.</w:t>
+        <w:t> A theoretical explanation for why certain existing unlearning methods are susceptible to knowledge recovery or performance degradation.</w:t>
       </w:r>
     </w:p>
     <w:p>
@@ -14056,34 +14039,7 @@
         <w:t>.</w:t>
       </w:r>
       <w:r>
-        <w:t xml:space="preserve"> In real-world applications, un</w:t>
-      </w:r>
-      <w:r>
-        <w:t xml:space="preserve">learning requests from different users often arrive sequentially. However, traditional recommendation unlearning methods process requests in batch mode, which, while effective in certain contexts, is impractical in dynamic environments where responsiveness is critical. In this sequential setting, exact unlearning, which requires </w:t>
-      </w:r>
-      <w:proofErr w:type="spellStart"/>
-      <w:r>
-        <w:t>fre</w:t>
-      </w:r>
-      <w:proofErr w:type="spellEnd"/>
-      <w:r>
-        <w:t/>
-      </w:r>
-      <w:proofErr w:type="spellStart"/>
-      <w:r>
-        <w:t>quent</w:t>
-      </w:r>
-      <w:proofErr w:type="spellEnd"/>
-      <w:r>
-        <w:t xml:space="preserve"> model retraining, becomes inefficient and may essentially be reduced to a condition where they must be retrained from scratch. On the other hand, </w:t>
-      </w:r>
-      <w:proofErr w:type="spellStart"/>
-      <w:r>
-        <w:t>approxi</w:t>
-      </w:r>
-      <w:proofErr w:type="spellEnd"/>
-      <w:r>
-        <w:t xml:space="preserve">mate unlearning faces a unique challenge in sequential settings: the estimation gap becomes more pronounced over time, making it more difficult to maintain utility and completeness in the recommendations. Therefore, the scenario of sequential unlearning remains worthy of further investigation. </w:t>
+        <w:t xml:space="preserve"> In real-world applications, unlearning requests from different users often arrive sequentially. However, traditional recommendation unlearning methods process requests in batch mode, which, while effective in certain contexts, is impractical in dynamic environments where responsiveness is critical. In this sequential setting, exact unlearning, which requires frequent model retraining, becomes inefficient and may essentially be reduced to a condition where they must be retrained from scratch. On the other hand, approximate unlearning faces a unique challenge in sequential settings: the estimation gap becomes more pronounced over time, making it more difficult to maintain utility and completeness in the recommendations. Therefore, the scenario of sequential unlearning remains worthy of further investigation. </w:t>
       </w:r>
     </w:p>
     <w:p>
@@ -16313,8 +16269,7 @@
     </w:p>
     <w:p>
       <w:pPr>
-        <w:pStyle w:val="Title"/>
-        <w:ind w:left="720"/>
+        <w:pStyle w:val="Heading1"/>
       </w:pPr>
       <w:r>
         <w:t xml:space="preserve">Section </w:t>
@@ -16473,8 +16428,8 @@
       <w:pPr>
         <w:pStyle w:val="Heading2"/>
         <w:numPr>
-          <w:ilvl w:val="0"/>
-          <w:numId w:val="52"/>
+          <w:ilvl w:val="2"/>
+          <w:numId w:val="7"/>
         </w:numPr>
         <w:jc w:val="both"/>
       </w:pPr>
@@ -16600,7 +16555,7 @@
         <w:pStyle w:val="Heading2"/>
         <w:numPr>
           <w:ilvl w:val="0"/>
-          <w:numId w:val="52"/>
+          <w:numId w:val="7"/>
         </w:numPr>
         <w:jc w:val="both"/>
       </w:pPr>
@@ -16767,15 +16722,15 @@
         <w:jc w:val="both"/>
       </w:pPr>
       <w:bookmarkStart w:id="47" w:name="_Classifications_of_Game"/>
-      <w:bookmarkStart w:id="48" w:name="_Hlk205721720"/>
-      <w:bookmarkStart w:id="49" w:name="_Toc206437444"/>
+      <w:bookmarkStart w:id="48" w:name="_Toc206437444"/>
+      <w:bookmarkStart w:id="49" w:name="_Hlk205721720"/>
       <w:bookmarkEnd w:id="47"/>
       <w:r>
         <w:t>Classifications of Game Theory Models</w:t>
       </w:r>
-      <w:bookmarkEnd w:id="49"/>
-    </w:p>
-    <w:bookmarkEnd w:id="48"/>
+      <w:bookmarkEnd w:id="48"/>
+    </w:p>
+    <w:bookmarkEnd w:id="49"/>
     <w:p>
       <w:pPr>
         <w:numPr>
@@ -18109,7 +18064,7 @@
         <w:pStyle w:val="Heading2"/>
         <w:numPr>
           <w:ilvl w:val="0"/>
-          <w:numId w:val="52"/>
+          <w:numId w:val="7"/>
         </w:numPr>
         <w:jc w:val="both"/>
       </w:pPr>
@@ -18207,7 +18162,7 @@
         <w:pStyle w:val="Heading2"/>
         <w:numPr>
           <w:ilvl w:val="0"/>
-          <w:numId w:val="52"/>
+          <w:numId w:val="7"/>
         </w:numPr>
         <w:jc w:val="both"/>
       </w:pPr>
@@ -18283,7 +18238,7 @@
         <w:pStyle w:val="Heading2"/>
         <w:numPr>
           <w:ilvl w:val="0"/>
-          <w:numId w:val="52"/>
+          <w:numId w:val="7"/>
         </w:numPr>
         <w:jc w:val="both"/>
       </w:pPr>
@@ -18333,15 +18288,7 @@
         </w:r>
       </w:hyperlink>
       <w:r>
-        <w:t xml:space="preserve"> Stefanos </w:t>
-      </w:r>
-      <w:proofErr w:type="spellStart"/>
-      <w:r>
-        <w:t>Leonardos</w:t>
-      </w:r>
-      <w:proofErr w:type="spellEnd"/>
-      <w:r>
-        <w:t xml:space="preserve"> and Georgios </w:t>
+        <w:t xml:space="preserve"> Stefanos Leonardos and Georgios </w:t>
       </w:r>
       <w:proofErr w:type="spellStart"/>
       <w:r>
@@ -18411,7 +18358,6 @@
         <w:jc w:val="both"/>
       </w:pPr>
       <w:proofErr w:type="spellStart"/>
-      <w:proofErr w:type="gramStart"/>
       <w:r>
         <w:rPr>
           <w:b/>
@@ -18430,7 +18376,6 @@
       <w:r>
         <w:t>:</w:t>
       </w:r>
-      <w:proofErr w:type="gramEnd"/>
       <w:r>
         <w:t xml:space="preserve"> </w:t>
       </w:r>
@@ -19282,39 +19227,7 @@
         </w:r>
       </w:hyperlink>
       <w:r>
-        <w:t xml:space="preserve"> Lei Cui, </w:t>
-      </w:r>
-      <w:proofErr w:type="spellStart"/>
-      <w:r>
-        <w:t>Youyang</w:t>
-      </w:r>
-      <w:proofErr w:type="spellEnd"/>
-      <w:r>
-        <w:t xml:space="preserve"> Qu, Mohammad Reza </w:t>
-      </w:r>
-      <w:proofErr w:type="spellStart"/>
-      <w:r>
-        <w:t>Nosouhi</w:t>
-      </w:r>
-      <w:proofErr w:type="spellEnd"/>
-      <w:r>
-        <w:t xml:space="preserve">, Shui Yu, </w:t>
-      </w:r>
-      <w:proofErr w:type="spellStart"/>
-      <w:r>
-        <w:t>Jianwei</w:t>
-      </w:r>
-      <w:proofErr w:type="spellEnd"/>
-      <w:r>
-        <w:t xml:space="preserve"> </w:t>
-      </w:r>
-      <w:proofErr w:type="spellStart"/>
-      <w:r>
-        <w:t>Niu</w:t>
-      </w:r>
-      <w:proofErr w:type="spellEnd"/>
-      <w:r>
-        <w:t>, and Gang Xie. 2019.</w:t>
+        <w:t xml:space="preserve"> Lei Cui, Youyang Qu, Mohammad Reza Nosouhi, Shui Yu, Jianwei Niu, and Gang Xie. 2019.</w:t>
       </w:r>
     </w:p>
     <w:p>
@@ -19461,15 +19374,7 @@
         <w:jc w:val="both"/>
       </w:pPr>
       <w:r>
-        <w:t xml:space="preserve">• This dataset was collected by McAuley and </w:t>
-      </w:r>
-      <w:proofErr w:type="spellStart"/>
-      <w:r>
-        <w:t>Leskovec</w:t>
-      </w:r>
-      <w:proofErr w:type="spellEnd"/>
-      <w:r>
-        <w:t>.</w:t>
+        <w:t>• This dataset was collected by McAuley and Leskovec.</w:t>
       </w:r>
     </w:p>
     <w:p>
@@ -19967,23 +19872,7 @@
         </w:r>
       </w:hyperlink>
       <w:r>
-        <w:t xml:space="preserve"> </w:t>
-      </w:r>
-      <w:proofErr w:type="spellStart"/>
-      <w:r>
-        <w:t>Xueqin</w:t>
-      </w:r>
-      <w:proofErr w:type="spellEnd"/>
-      <w:r>
-        <w:t xml:space="preserve"> Liang, Zheng Yan, Robert H. Deng, and </w:t>
-      </w:r>
-      <w:proofErr w:type="spellStart"/>
-      <w:r>
-        <w:t>Qinghua</w:t>
-      </w:r>
-      <w:proofErr w:type="spellEnd"/>
-      <w:r>
-        <w:t xml:space="preserve"> Zheng. 2021. </w:t>
+        <w:t xml:space="preserve"> Xueqin Liang, Zheng Yan, Robert H. Deng, and Qinghua Zheng. 2021. </w:t>
       </w:r>
     </w:p>
     <w:p>
@@ -20079,7 +19968,21 @@
           <w:rPr>
             <w:rStyle w:val="Hyperlink"/>
           </w:rPr>
-          <w:t>Investigating the Adoption of Hybrid Encrypted Cloud Data Deduplication With Game Theory | IEEE Journals &amp; Magazine | IEEE Xplore</w:t>
+          <w:t xml:space="preserve">Investigating the Adoption of Hybrid Encrypted Cloud Data Deduplication </w:t>
+        </w:r>
+        <w:proofErr w:type="gramStart"/>
+        <w:r>
+          <w:rPr>
+            <w:rStyle w:val="Hyperlink"/>
+          </w:rPr>
+          <w:t>With</w:t>
+        </w:r>
+        <w:proofErr w:type="gramEnd"/>
+        <w:r>
+          <w:rPr>
+            <w:rStyle w:val="Hyperlink"/>
+          </w:rPr>
+          <w:t xml:space="preserve"> Game Theory | IEEE Journals &amp; Magazine | IEEE Xplore</w:t>
         </w:r>
       </w:hyperlink>
     </w:p>
@@ -20129,15 +20032,7 @@
         <w:jc w:val="both"/>
       </w:pPr>
       <w:r>
-        <w:t xml:space="preserve">• This dataset was collected by McAuley and </w:t>
-      </w:r>
-      <w:proofErr w:type="spellStart"/>
-      <w:r>
-        <w:t>Leskovec</w:t>
-      </w:r>
-      <w:proofErr w:type="spellEnd"/>
-      <w:r>
-        <w:t>.</w:t>
+        <w:t>• This dataset was collected by McAuley and Leskovec.</w:t>
       </w:r>
     </w:p>
     <w:p>
@@ -20628,23 +20523,7 @@
         <w:t>5</w:t>
       </w:r>
       <w:r>
-        <w:t xml:space="preserve">] </w:t>
-      </w:r>
-      <w:proofErr w:type="spellStart"/>
-      <w:r>
-        <w:t>Xueqin</w:t>
-      </w:r>
-      <w:proofErr w:type="spellEnd"/>
-      <w:r>
-        <w:t xml:space="preserve"> Liang, Zheng Yan, Robert H. Deng, and </w:t>
-      </w:r>
-      <w:proofErr w:type="spellStart"/>
-      <w:r>
-        <w:t>Qinghua</w:t>
-      </w:r>
-      <w:proofErr w:type="spellEnd"/>
-      <w:r>
-        <w:t xml:space="preserve"> Zheng. 2021. Investigating the adoption of hybrid encrypted cloud data deduplication with game theory. IEEE Trans. Parallel </w:t>
+        <w:t xml:space="preserve">] Xueqin Liang, Zheng Yan, Robert H. Deng, and Qinghua Zheng. 2021. Investigating the adoption of hybrid encrypted cloud data deduplication with game theory. IEEE Trans. Parallel </w:t>
       </w:r>
       <w:proofErr w:type="spellStart"/>
       <w:r>
@@ -20862,15 +20741,7 @@
               </w:rPr>
             </w:pPr>
             <w:r>
-              <w:t xml:space="preserve">Stefanos </w:t>
-            </w:r>
-            <w:proofErr w:type="spellStart"/>
-            <w:r>
-              <w:t>Leonardos</w:t>
-            </w:r>
-            <w:proofErr w:type="spellEnd"/>
-            <w:r>
-              <w:t xml:space="preserve"> </w:t>
+              <w:t xml:space="preserve">Stefanos Leonardos </w:t>
             </w:r>
             <w:r>
               <w:t>et al</w:t>
@@ -21267,23 +21138,7 @@
               <w:t>5</w:t>
             </w:r>
             <w:r>
-              <w:t xml:space="preserve">] </w:t>
-            </w:r>
-            <w:proofErr w:type="spellStart"/>
-            <w:r>
-              <w:t>Xueqin</w:t>
-            </w:r>
-            <w:proofErr w:type="spellEnd"/>
-            <w:r>
-              <w:t xml:space="preserve"> Liang, Zheng Yan, Robert H. Deng, and </w:t>
-            </w:r>
-            <w:proofErr w:type="spellStart"/>
-            <w:r>
-              <w:t>Qinghua</w:t>
-            </w:r>
-            <w:proofErr w:type="spellEnd"/>
-            <w:r>
-              <w:t xml:space="preserve"> Zheng. 2021. Investigating the adoption of hybrid encrypted cloud data deduplication with game theory. IEEE Trans. Parallel </w:t>
+              <w:t xml:space="preserve">] Xueqin Liang, Zheng Yan, Robert H. Deng, and Qinghua Zheng. 2021. Investigating the adoption of hybrid encrypted cloud data deduplication with game theory. IEEE Trans. Parallel </w:t>
             </w:r>
             <w:proofErr w:type="spellStart"/>
             <w:r>
@@ -21412,7 +21267,7 @@
         <w:pStyle w:val="Heading2"/>
         <w:numPr>
           <w:ilvl w:val="0"/>
-          <w:numId w:val="52"/>
+          <w:numId w:val="7"/>
         </w:numPr>
         <w:jc w:val="both"/>
       </w:pPr>
@@ -21588,7 +21443,7 @@
         <w:pStyle w:val="Heading2"/>
         <w:numPr>
           <w:ilvl w:val="0"/>
-          <w:numId w:val="52"/>
+          <w:numId w:val="7"/>
         </w:numPr>
         <w:jc w:val="both"/>
       </w:pPr>
@@ -21665,15 +21520,7 @@
         <w:jc w:val="both"/>
       </w:pPr>
       <w:r>
-        <w:t xml:space="preserve">Second, the paper by </w:t>
-      </w:r>
-      <w:proofErr w:type="spellStart"/>
-      <w:r>
-        <w:t>Xueqin</w:t>
-      </w:r>
-      <w:proofErr w:type="spellEnd"/>
-      <w:r>
-        <w:t xml:space="preserve"> Liang et al. on "Investigating the adoption of hybrid encrypted cloud data deduplication with game theory" will be analyzed. The focus here will be on the </w:t>
+        <w:t xml:space="preserve">Second, the paper by Xueqin Liang et al. on "Investigating the adoption of hybrid encrypted cloud data deduplication with game theory" will be analyzed. The focus here will be on the </w:t>
       </w:r>
       <w:r>
         <w:rPr>
@@ -22128,7 +21975,7 @@
         <w:pStyle w:val="Heading2"/>
         <w:numPr>
           <w:ilvl w:val="0"/>
-          <w:numId w:val="52"/>
+          <w:numId w:val="7"/>
         </w:numPr>
         <w:jc w:val="both"/>
       </w:pPr>
@@ -22189,7 +22036,7 @@
         <w:pStyle w:val="Heading2"/>
         <w:numPr>
           <w:ilvl w:val="0"/>
-          <w:numId w:val="52"/>
+          <w:numId w:val="7"/>
         </w:numPr>
         <w:jc w:val="both"/>
       </w:pPr>
@@ -22338,7 +22185,7 @@
         <w:pStyle w:val="Heading2"/>
         <w:numPr>
           <w:ilvl w:val="0"/>
-          <w:numId w:val="52"/>
+          <w:numId w:val="7"/>
         </w:numPr>
         <w:jc w:val="both"/>
       </w:pPr>
@@ -22542,7 +22389,7 @@
         <w:pStyle w:val="Heading2"/>
         <w:numPr>
           <w:ilvl w:val="0"/>
-          <w:numId w:val="52"/>
+          <w:numId w:val="7"/>
         </w:numPr>
         <w:jc w:val="both"/>
       </w:pPr>
@@ -22699,7 +22546,7 @@
         <w:pStyle w:val="Heading2"/>
         <w:numPr>
           <w:ilvl w:val="0"/>
-          <w:numId w:val="52"/>
+          <w:numId w:val="7"/>
         </w:numPr>
         <w:jc w:val="both"/>
       </w:pPr>
@@ -22809,7 +22656,7 @@
         <w:pStyle w:val="Heading2"/>
         <w:numPr>
           <w:ilvl w:val="0"/>
-          <w:numId w:val="52"/>
+          <w:numId w:val="7"/>
         </w:numPr>
         <w:jc w:val="both"/>
       </w:pPr>
@@ -22843,7 +22690,7 @@
         <w:pStyle w:val="Heading2"/>
         <w:numPr>
           <w:ilvl w:val="0"/>
-          <w:numId w:val="52"/>
+          <w:numId w:val="7"/>
         </w:numPr>
         <w:jc w:val="both"/>
       </w:pPr>
@@ -23207,6 +23054,7 @@
         <w:rPr>
           <w:rStyle w:val="Heading3Char"/>
         </w:rPr>
+        <w:lastRenderedPageBreak/>
         <w:t>Real-World Complex Requests</w:t>
       </w:r>
       <w:bookmarkEnd w:id="75"/>
@@ -23694,6 +23542,7 @@
       </w:pPr>
       <w:bookmarkStart w:id="77" w:name="_Toc206437472"/>
       <w:r>
+        <w:lastRenderedPageBreak/>
         <w:t>Literature Review</w:t>
       </w:r>
       <w:bookmarkEnd w:id="77"/>
@@ -23713,204 +23562,204 @@
       </w:pPr>
       <w:bookmarkStart w:id="78" w:name="_Toc206437473"/>
       <w:r>
+        <w:t>Research Objectives</w:t>
+      </w:r>
+      <w:bookmarkEnd w:id="78"/>
+    </w:p>
+    <w:p>
+      <w:pPr>
+        <w:pStyle w:val="Heading3"/>
+        <w:jc w:val="both"/>
+      </w:pPr>
+      <w:bookmarkStart w:id="79" w:name="_Toc206437474"/>
+      <w:r>
+        <w:t>Primary Objective</w:t>
+      </w:r>
+      <w:bookmarkEnd w:id="79"/>
+      <w:r>
+        <w:t xml:space="preserve"> </w:t>
+      </w:r>
+    </w:p>
+    <w:p>
+      <w:pPr>
+        <w:jc w:val="both"/>
+      </w:pPr>
+      <w:r>
+        <w:t xml:space="preserve">This research proposes a novel approach to address the complexity of unlearning by </w:t>
+      </w:r>
+      <w:r>
+        <w:rPr>
+          <w:b/>
+          <w:bCs/>
+        </w:rPr>
+        <w:t>shifting the calculation of influence from the original training samples to a meticulously identified group of specific features</w:t>
+      </w:r>
+      <w:r>
+        <w:t>.</w:t>
+      </w:r>
+    </w:p>
+    <w:p>
+      <w:pPr>
+        <w:ind w:left="720"/>
+        <w:jc w:val="both"/>
+      </w:pPr>
+      <w:r>
+        <w:t xml:space="preserve">When an unlearning request arrives, the influence will be calculated based on the contribution of these selected features, rather than directly on the raw training samples. This paradigm shift aims to </w:t>
+      </w:r>
+      <w:r>
+        <w:rPr>
+          <w:b/>
+          <w:bCs/>
+        </w:rPr>
+        <w:t>reduce computational complexity, enhance unlearning efficiency, and provide a more granular control over the unlearning process.</w:t>
+      </w:r>
+    </w:p>
+    <w:p>
+      <w:pPr>
+        <w:ind w:left="720"/>
+        <w:jc w:val="both"/>
+      </w:pPr>
+      <w:r>
+        <w:t xml:space="preserve">We hypothesize that by focusing on the most influential features, we can effectively isolate and remove the impact of unwanted data while </w:t>
+      </w:r>
+      <w:r>
+        <w:rPr>
+          <w:b/>
+          <w:bCs/>
+        </w:rPr>
+        <w:t>minimizing collateral damage to the model's performance on the remaining, desired data</w:t>
+      </w:r>
+      <w:r>
+        <w:t xml:space="preserve">. This will involve integrating concepts from </w:t>
+      </w:r>
+      <w:r>
+        <w:rPr>
+          <w:b/>
+          <w:bCs/>
+        </w:rPr>
+        <w:t>feature extraction</w:t>
+      </w:r>
+      <w:r>
+        <w:t xml:space="preserve">, </w:t>
+      </w:r>
+      <w:r>
+        <w:rPr>
+          <w:b/>
+          <w:bCs/>
+        </w:rPr>
+        <w:t>feature generation</w:t>
+      </w:r>
+      <w:r>
+        <w:t xml:space="preserve">, and </w:t>
+      </w:r>
+      <w:r>
+        <w:rPr>
+          <w:b/>
+          <w:bCs/>
+        </w:rPr>
+        <w:t>feature selection</w:t>
+      </w:r>
+      <w:r>
+        <w:t xml:space="preserve"> to create a robust and efficient feature-based unlearning framework.</w:t>
+      </w:r>
+    </w:p>
+    <w:p>
+      <w:pPr>
+        <w:pStyle w:val="Heading3"/>
+        <w:jc w:val="both"/>
+      </w:pPr>
+      <w:bookmarkStart w:id="80" w:name="_Toc206437475"/>
+      <w:r>
+        <w:t xml:space="preserve">Secondary </w:t>
+      </w:r>
+      <w:r>
+        <w:t>Objectives</w:t>
+      </w:r>
+      <w:bookmarkEnd w:id="80"/>
+    </w:p>
+    <w:p>
+      <w:pPr>
+        <w:ind w:left="720"/>
+        <w:jc w:val="both"/>
+      </w:pPr>
+      <w:r>
+        <w:t xml:space="preserve">• To </w:t>
+      </w:r>
+      <w:r>
+        <w:rPr>
+          <w:b/>
+          <w:bCs/>
+        </w:rPr>
+        <w:t>design and implement robust techniques for identifying and extracting relevant features</w:t>
+      </w:r>
+      <w:r>
+        <w:t xml:space="preserve"> within instances, particularly addressing scenarios where explicit annotation information for these features is unavailable.</w:t>
+      </w:r>
+    </w:p>
+    <w:p>
+      <w:pPr>
+        <w:ind w:left="720"/>
+        <w:jc w:val="both"/>
+      </w:pPr>
+      <w:r>
+        <w:t xml:space="preserve">• To </w:t>
+      </w:r>
+      <w:r>
+        <w:rPr>
+          <w:b/>
+          <w:bCs/>
+        </w:rPr>
+        <w:t>develop and formalize mechanisms for calculating the influence of specific features or feature subsets</w:t>
+      </w:r>
+      <w:r>
+        <w:t xml:space="preserve"> on model parameters and predictions, adapting existing influence function theories for a feature-centric approach.</w:t>
+      </w:r>
+    </w:p>
+    <w:p>
+      <w:pPr>
+        <w:ind w:left="720"/>
+        <w:jc w:val="both"/>
+      </w:pPr>
+      <w:r>
+        <w:t xml:space="preserve">• To </w:t>
+      </w:r>
+      <w:r>
+        <w:rPr>
+          <w:b/>
+          <w:bCs/>
+        </w:rPr>
+        <w:t>integrate these feature influence calculation methods with model-shifting unlearning strategies</w:t>
+      </w:r>
+      <w:r>
+        <w:t xml:space="preserve"> to create practical and effective feature-based scrubbing procedures for deep neural networks.</w:t>
+      </w:r>
+    </w:p>
+    <w:p>
+      <w:pPr>
+        <w:ind w:left="720"/>
+        <w:jc w:val="both"/>
+      </w:pPr>
+      <w:r>
+        <w:t xml:space="preserve">• To </w:t>
+      </w:r>
+      <w:r>
+        <w:rPr>
+          <w:b/>
+          <w:bCs/>
+        </w:rPr>
+        <w:t>establish and validate appropriate evaluation metrics and protocols for assessing the effectiveness of feature-level unlearning</w:t>
+      </w:r>
+      <w:r>
+        <w:t>, considering both quantitative (e.g., information leakage reduction) and qualitative (e.g., visual confirmation of feature removal) measures.</w:t>
+      </w:r>
+    </w:p>
+    <w:p>
+      <w:pPr>
+        <w:ind w:left="720"/>
+        <w:jc w:val="both"/>
+      </w:pPr>
+      <w:r>
         <w:lastRenderedPageBreak/>
-        <w:t>Research Objectives</w:t>
-      </w:r>
-      <w:bookmarkEnd w:id="78"/>
-    </w:p>
-    <w:p>
-      <w:pPr>
-        <w:pStyle w:val="Heading3"/>
-        <w:jc w:val="both"/>
-      </w:pPr>
-      <w:bookmarkStart w:id="79" w:name="_Toc206437474"/>
-      <w:r>
-        <w:t>Primary Objective</w:t>
-      </w:r>
-      <w:bookmarkEnd w:id="79"/>
-      <w:r>
-        <w:t xml:space="preserve"> </w:t>
-      </w:r>
-    </w:p>
-    <w:p>
-      <w:pPr>
-        <w:jc w:val="both"/>
-      </w:pPr>
-      <w:r>
-        <w:t xml:space="preserve">This research proposes a novel approach to address the complexity of unlearning by </w:t>
-      </w:r>
-      <w:r>
-        <w:rPr>
-          <w:b/>
-          <w:bCs/>
-        </w:rPr>
-        <w:t>shifting the calculation of influence from the original training samples to a meticulously identified group of specific features</w:t>
-      </w:r>
-      <w:r>
-        <w:t>.</w:t>
-      </w:r>
-    </w:p>
-    <w:p>
-      <w:pPr>
-        <w:ind w:left="720"/>
-        <w:jc w:val="both"/>
-      </w:pPr>
-      <w:r>
-        <w:t xml:space="preserve">When an unlearning request arrives, the influence will be calculated based on the contribution of these selected features, rather than directly on the raw training samples. This paradigm shift aims to </w:t>
-      </w:r>
-      <w:r>
-        <w:rPr>
-          <w:b/>
-          <w:bCs/>
-        </w:rPr>
-        <w:t>reduce computational complexity, enhance unlearning efficiency, and provide a more granular control over the unlearning process.</w:t>
-      </w:r>
-    </w:p>
-    <w:p>
-      <w:pPr>
-        <w:ind w:left="720"/>
-        <w:jc w:val="both"/>
-      </w:pPr>
-      <w:r>
-        <w:t xml:space="preserve">We hypothesize that by focusing on the most influential features, we can effectively isolate and remove the impact of unwanted data while </w:t>
-      </w:r>
-      <w:r>
-        <w:rPr>
-          <w:b/>
-          <w:bCs/>
-        </w:rPr>
-        <w:t>minimizing collateral damage to the model's performance on the remaining, desired data</w:t>
-      </w:r>
-      <w:r>
-        <w:t xml:space="preserve">. This will involve integrating concepts from </w:t>
-      </w:r>
-      <w:r>
-        <w:rPr>
-          <w:b/>
-          <w:bCs/>
-        </w:rPr>
-        <w:t>feature extraction</w:t>
-      </w:r>
-      <w:r>
-        <w:t xml:space="preserve">, </w:t>
-      </w:r>
-      <w:r>
-        <w:rPr>
-          <w:b/>
-          <w:bCs/>
-        </w:rPr>
-        <w:t>feature generation</w:t>
-      </w:r>
-      <w:r>
-        <w:t xml:space="preserve">, and </w:t>
-      </w:r>
-      <w:r>
-        <w:rPr>
-          <w:b/>
-          <w:bCs/>
-        </w:rPr>
-        <w:t>feature selection</w:t>
-      </w:r>
-      <w:r>
-        <w:t xml:space="preserve"> to create a robust and efficient feature-based unlearning framework.</w:t>
-      </w:r>
-    </w:p>
-    <w:p>
-      <w:pPr>
-        <w:pStyle w:val="Heading3"/>
-        <w:jc w:val="both"/>
-      </w:pPr>
-      <w:bookmarkStart w:id="80" w:name="_Toc206437475"/>
-      <w:r>
-        <w:t xml:space="preserve">Secondary </w:t>
-      </w:r>
-      <w:r>
-        <w:t>Objectives</w:t>
-      </w:r>
-      <w:bookmarkEnd w:id="80"/>
-    </w:p>
-    <w:p>
-      <w:pPr>
-        <w:ind w:left="720"/>
-        <w:jc w:val="both"/>
-      </w:pPr>
-      <w:r>
-        <w:t xml:space="preserve">• To </w:t>
-      </w:r>
-      <w:r>
-        <w:rPr>
-          <w:b/>
-          <w:bCs/>
-        </w:rPr>
-        <w:t>design and implement robust techniques for identifying and extracting relevant features</w:t>
-      </w:r>
-      <w:r>
-        <w:t xml:space="preserve"> within instances, particularly addressing scenarios where explicit annotation information for these features is unavailable.</w:t>
-      </w:r>
-    </w:p>
-    <w:p>
-      <w:pPr>
-        <w:ind w:left="720"/>
-        <w:jc w:val="both"/>
-      </w:pPr>
-      <w:r>
-        <w:t xml:space="preserve">• To </w:t>
-      </w:r>
-      <w:r>
-        <w:rPr>
-          <w:b/>
-          <w:bCs/>
-        </w:rPr>
-        <w:t>develop and formalize mechanisms for calculating the influence of specific features or feature subsets</w:t>
-      </w:r>
-      <w:r>
-        <w:t xml:space="preserve"> on model parameters and predictions, adapting existing influence function theories for a feature-centric approach.</w:t>
-      </w:r>
-    </w:p>
-    <w:p>
-      <w:pPr>
-        <w:ind w:left="720"/>
-        <w:jc w:val="both"/>
-      </w:pPr>
-      <w:r>
-        <w:t xml:space="preserve">• To </w:t>
-      </w:r>
-      <w:r>
-        <w:rPr>
-          <w:b/>
-          <w:bCs/>
-        </w:rPr>
-        <w:t>integrate these feature influence calculation methods with model-shifting unlearning strategies</w:t>
-      </w:r>
-      <w:r>
-        <w:t xml:space="preserve"> to create practical and effective feature-based scrubbing procedures for deep neural networks.</w:t>
-      </w:r>
-    </w:p>
-    <w:p>
-      <w:pPr>
-        <w:ind w:left="720"/>
-        <w:jc w:val="both"/>
-      </w:pPr>
-      <w:r>
-        <w:t xml:space="preserve">• To </w:t>
-      </w:r>
-      <w:r>
-        <w:rPr>
-          <w:b/>
-          <w:bCs/>
-        </w:rPr>
-        <w:t>establish and validate appropriate evaluation metrics and protocols for assessing the effectiveness of feature-level unlearning</w:t>
-      </w:r>
-      <w:r>
-        <w:t>, considering both quantitative (e.g., information leakage reduction) and qualitative (e.g., visual confirmation of feature removal) measures.</w:t>
-      </w:r>
-    </w:p>
-    <w:p>
-      <w:pPr>
-        <w:ind w:left="720"/>
-        <w:jc w:val="both"/>
-      </w:pPr>
-      <w:r>
         <w:t xml:space="preserve">• To </w:t>
       </w:r>
       <w:r>
@@ -24099,6 +23948,7 @@
         <w:jc w:val="both"/>
       </w:pPr>
       <w:r>
+        <w:lastRenderedPageBreak/>
         <w:t>1.3 Defining "Unlearning Features" (Feature Generation for Representation):</w:t>
       </w:r>
     </w:p>
@@ -24137,176 +23987,176 @@
         <w:t>characteristics</w:t>
       </w:r>
       <w:r>
-        <w:t xml:space="preserve"> that need to be removed from the model. For instance, if unlearning a specific class, we might generate features that represent the "anti-</w:t>
+        <w:t xml:space="preserve"> that need to be removed from the model. For instance, if unlearning a specific class, we might generate features that represent the "anti-prototype" of that class. This allows us to work with abstract feature representations rather than concrete data samples.</w:t>
+      </w:r>
+    </w:p>
+    <w:p>
+      <w:pPr>
+        <w:jc w:val="both"/>
+      </w:pPr>
+      <w:r>
+        <w:t xml:space="preserve">    ◦ </w:t>
+      </w:r>
+      <w:r>
+        <w:rPr>
+          <w:b/>
+          <w:bCs/>
+        </w:rPr>
+        <w:t>Output:</w:t>
+      </w:r>
+      <w:r>
+        <w:t xml:space="preserve"> A compact set of synthetic "unlearning features" that represent the knowledge to be erased.</w:t>
+      </w:r>
+    </w:p>
+    <w:p>
+      <w:pPr>
+        <w:pStyle w:val="Heading3"/>
+        <w:jc w:val="both"/>
+      </w:pPr>
+      <w:bookmarkStart w:id="83" w:name="_Toc206437478"/>
+      <w:r>
+        <w:t>Phase 2: Feature-Based Influence Calculation and Unlearning Mechanism</w:t>
+      </w:r>
+      <w:bookmarkEnd w:id="83"/>
+    </w:p>
+    <w:p>
+      <w:pPr>
+        <w:jc w:val="both"/>
+      </w:pPr>
+      <w:r>
+        <w:t>This phase designs how the influence is calculated in the feature space and how the model is updated.</w:t>
+      </w:r>
+    </w:p>
+    <w:p>
+      <w:pPr>
+        <w:pStyle w:val="Heading4"/>
+        <w:jc w:val="both"/>
+      </w:pPr>
+      <w:r>
+        <w:t>2.1 Feature-Based Influence Metric:</w:t>
+      </w:r>
+    </w:p>
+    <w:p>
+      <w:pPr>
+        <w:jc w:val="both"/>
+      </w:pPr>
+      <w:r>
+        <w:t xml:space="preserve">    ◦ </w:t>
+      </w:r>
+      <w:r>
+        <w:rPr>
+          <w:b/>
+          <w:bCs/>
+        </w:rPr>
+        <w:t>Process:</w:t>
+      </w:r>
+      <w:r>
+        <w:t xml:space="preserve"> Develop a metric to quantify the "influence" or "contribution" of the identified "unlearning features" on the model's predictions or parameters. This could be achieved through:</w:t>
+      </w:r>
+    </w:p>
+    <w:p>
+      <w:pPr>
+        <w:jc w:val="both"/>
+      </w:pPr>
+      <w:r>
+        <w:t xml:space="preserve">        ▪ </w:t>
+      </w:r>
+      <w:r>
+        <w:rPr>
+          <w:b/>
+          <w:bCs/>
+        </w:rPr>
+        <w:t>Adversarial Unlearning:</w:t>
+      </w:r>
+      <w:r>
+        <w:t xml:space="preserve"> Analogous to P-FEAT's adversarial training where a "privacy attacking network" aims to </w:t>
+      </w:r>
+      <w:r>
+        <w:rPr>
+          <w:b/>
+          <w:bCs/>
+        </w:rPr>
+        <w:t>maximize loss for privacy-sensitive attributes</w:t>
+      </w:r>
+      <w:r>
+        <w:t xml:space="preserve">, we can train a component that attempts to maximize the model's "loss" or "error" concerning the knowledge represented by the "unlearning features." The gradient of this "unlearning loss" with respect to model parameters would represent the feature-based influence. This creates a </w:t>
+      </w:r>
+      <w:r>
+        <w:rPr>
+          <w:b/>
+          <w:bCs/>
+        </w:rPr>
+        <w:t>competitive relationship</w:t>
+      </w:r>
+      <w:r>
+        <w:t xml:space="preserve"> where the model's main task goal is balanced against the unlearning goal.</w:t>
+      </w:r>
+    </w:p>
+    <w:p>
+      <w:pPr>
+        <w:jc w:val="both"/>
+      </w:pPr>
+      <w:r>
+        <w:t xml:space="preserve">        ▪ </w:t>
+      </w:r>
+      <w:r>
+        <w:rPr>
+          <w:b/>
+          <w:bCs/>
+        </w:rPr>
+        <w:t>Reliability-Weighted Unlearning:</w:t>
+      </w:r>
+      <w:r>
+        <w:t xml:space="preserve"> Adapting SFG's "reliability assessment (RA) metric" which assigns a "reliability score" to generated features, we can assign an influence score to features based on their perceived importance to the specific information targeted for unlearning. Features with higher "positive" influence on the unwanted knowledge would be prioritized for reduction.</w:t>
+      </w:r>
+    </w:p>
+    <w:p>
+      <w:pPr>
+        <w:jc w:val="both"/>
+      </w:pPr>
+      <w:r>
+        <w:t xml:space="preserve">    ◦ </w:t>
+      </w:r>
+      <w:r>
+        <w:rPr>
+          <w:b/>
+          <w:bCs/>
+        </w:rPr>
+        <w:t>Output:</w:t>
+      </w:r>
+      <w:r>
+        <w:t xml:space="preserve"> A quantifiable measure of influence for the selected unlearning features on the model.</w:t>
+      </w:r>
+    </w:p>
+    <w:p>
+      <w:pPr>
+        <w:pStyle w:val="Heading4"/>
+        <w:jc w:val="both"/>
+      </w:pPr>
+      <w:r>
+        <w:t>2.2 Model Shifting/Update based on Feature Influence:</w:t>
+      </w:r>
+    </w:p>
+    <w:p>
+      <w:pPr>
+        <w:jc w:val="both"/>
+      </w:pPr>
+      <w:r>
+        <w:t xml:space="preserve">    ◦ </w:t>
+      </w:r>
+      <w:r>
+        <w:rPr>
+          <w:b/>
+          <w:bCs/>
+        </w:rPr>
+        <w:t>Process:</w:t>
+      </w:r>
+      <w:r>
+        <w:t xml:space="preserve"> Implement a mechanism to modify the model's parameters directly based on the calculated feature-based influence. This involves updating the model in a direction that </w:t>
       </w:r>
       <w:r>
         <w:lastRenderedPageBreak/>
-        <w:t>prototype" of that class. This allows us to work with abstract feature representations rather than concrete data samples.</w:t>
-      </w:r>
-    </w:p>
-    <w:p>
-      <w:pPr>
-        <w:jc w:val="both"/>
-      </w:pPr>
-      <w:r>
-        <w:t xml:space="preserve">    ◦ </w:t>
-      </w:r>
-      <w:r>
-        <w:rPr>
-          <w:b/>
-          <w:bCs/>
-        </w:rPr>
-        <w:t>Output:</w:t>
-      </w:r>
-      <w:r>
-        <w:t xml:space="preserve"> A compact set of synthetic "unlearning features" that represent the knowledge to be erased.</w:t>
-      </w:r>
-    </w:p>
-    <w:p>
-      <w:pPr>
-        <w:pStyle w:val="Heading3"/>
-        <w:jc w:val="both"/>
-      </w:pPr>
-      <w:bookmarkStart w:id="83" w:name="_Toc206437478"/>
-      <w:r>
-        <w:t>Phase 2: Feature-Based Influence Calculation and Unlearning Mechanism</w:t>
-      </w:r>
-      <w:bookmarkEnd w:id="83"/>
-    </w:p>
-    <w:p>
-      <w:pPr>
-        <w:jc w:val="both"/>
-      </w:pPr>
-      <w:r>
-        <w:t>This phase designs how the influence is calculated in the feature space and how the model is updated.</w:t>
-      </w:r>
-    </w:p>
-    <w:p>
-      <w:pPr>
-        <w:pStyle w:val="Heading4"/>
-        <w:jc w:val="both"/>
-      </w:pPr>
-      <w:r>
-        <w:t>2.1 Feature-Based Influence Metric:</w:t>
-      </w:r>
-    </w:p>
-    <w:p>
-      <w:pPr>
-        <w:jc w:val="both"/>
-      </w:pPr>
-      <w:r>
-        <w:t xml:space="preserve">    ◦ </w:t>
-      </w:r>
-      <w:r>
-        <w:rPr>
-          <w:b/>
-          <w:bCs/>
-        </w:rPr>
-        <w:t>Process:</w:t>
-      </w:r>
-      <w:r>
-        <w:t xml:space="preserve"> Develop a metric to quantify the "influence" or "contribution" of the identified "unlearning features" on the model's predictions or parameters. This could be achieved through:</w:t>
-      </w:r>
-    </w:p>
-    <w:p>
-      <w:pPr>
-        <w:jc w:val="both"/>
-      </w:pPr>
-      <w:r>
-        <w:t xml:space="preserve">        ▪ </w:t>
-      </w:r>
-      <w:r>
-        <w:rPr>
-          <w:b/>
-          <w:bCs/>
-        </w:rPr>
-        <w:t>Adversarial Unlearning:</w:t>
-      </w:r>
-      <w:r>
-        <w:t xml:space="preserve"> Analogous to P-FEAT's adversarial training where a "privacy attacking network" aims to </w:t>
-      </w:r>
-      <w:r>
-        <w:rPr>
-          <w:b/>
-          <w:bCs/>
-        </w:rPr>
-        <w:t>maximize loss for privacy-sensitive attributes</w:t>
-      </w:r>
-      <w:r>
-        <w:t xml:space="preserve">, we can train a component that attempts to maximize the model's "loss" or "error" concerning the knowledge represented by the "unlearning features." The gradient of this "unlearning loss" with respect to model parameters would represent the feature-based influence. This creates a </w:t>
-      </w:r>
-      <w:r>
-        <w:rPr>
-          <w:b/>
-          <w:bCs/>
-        </w:rPr>
-        <w:t>competitive relationship</w:t>
-      </w:r>
-      <w:r>
-        <w:t xml:space="preserve"> where the model's main task goal is balanced against the unlearning goal.</w:t>
-      </w:r>
-    </w:p>
-    <w:p>
-      <w:pPr>
-        <w:jc w:val="both"/>
-      </w:pPr>
-      <w:r>
-        <w:t xml:space="preserve">        ▪ </w:t>
-      </w:r>
-      <w:r>
-        <w:rPr>
-          <w:b/>
-          <w:bCs/>
-        </w:rPr>
-        <w:t>Reliability-Weighted Unlearning:</w:t>
-      </w:r>
-      <w:r>
-        <w:t xml:space="preserve"> Adapting SFG's "reliability assessment (RA) metric" which assigns a "reliability score" to generated features, we can assign an influence score to features based on their perceived importance to the specific information targeted for unlearning. Features with higher "positive" influence on the unwanted knowledge would be prioritized for reduction.</w:t>
-      </w:r>
-    </w:p>
-    <w:p>
-      <w:pPr>
-        <w:jc w:val="both"/>
-      </w:pPr>
-      <w:r>
-        <w:t xml:space="preserve">    ◦ </w:t>
-      </w:r>
-      <w:r>
-        <w:rPr>
-          <w:b/>
-          <w:bCs/>
-        </w:rPr>
-        <w:t>Output:</w:t>
-      </w:r>
-      <w:r>
-        <w:t xml:space="preserve"> A quantifiable measure of influence for the selected unlearning features on the model.</w:t>
-      </w:r>
-    </w:p>
-    <w:p>
-      <w:pPr>
-        <w:pStyle w:val="Heading4"/>
-        <w:jc w:val="both"/>
-      </w:pPr>
-      <w:r>
-        <w:t>2.2 Model Shifting/Update based on Feature Influence:</w:t>
-      </w:r>
-    </w:p>
-    <w:p>
-      <w:pPr>
-        <w:jc w:val="both"/>
-      </w:pPr>
-      <w:r>
-        <w:t xml:space="preserve">    ◦ </w:t>
-      </w:r>
-      <w:r>
-        <w:rPr>
-          <w:b/>
-          <w:bCs/>
-        </w:rPr>
-        <w:t>Process:</w:t>
-      </w:r>
-      <w:r>
-        <w:t xml:space="preserve"> Implement a mechanism to modify the model's parameters directly based on the calculated feature-based influence. This involves updating the model in a direction that reduces the influence of the "unlearning features" while trying to preserve the model's performance on the rest of the data. This might involve a </w:t>
+        <w:t xml:space="preserve">reduces the influence of the "unlearning features" while trying to preserve the model's performance on the rest of the data. This might involve a </w:t>
       </w:r>
       <w:r>
         <w:rPr>
@@ -24360,7 +24210,6 @@
         <w:jc w:val="both"/>
       </w:pPr>
       <w:r>
-        <w:lastRenderedPageBreak/>
         <w:t xml:space="preserve">    ◦ </w:t>
       </w:r>
       <w:r>
@@ -24559,6 +24408,7 @@
         <w:rPr>
           <w:rFonts w:eastAsia="Times New Roman"/>
         </w:rPr>
+        <w:lastRenderedPageBreak/>
         <w:t>Anticipated Results</w:t>
       </w:r>
       <w:bookmarkEnd w:id="85"/>
@@ -24612,7 +24462,6 @@
         <w:jc w:val="both"/>
       </w:pPr>
       <w:r>
-        <w:lastRenderedPageBreak/>
         <w:t xml:space="preserve">• Insights into the </w:t>
       </w:r>
       <w:r>
@@ -24703,7 +24552,11 @@
         <w:jc w:val="both"/>
       </w:pPr>
       <w:r>
-        <w:t>To address these critical challenges, the field of LLM unlearning has emerged, aiming to remove specific information or behaviors from models while preserving their overall performance. Unlike traditional approaches that necessitate costly and time-consuming full model retraining, LLM unlearning seeks to achieve targeted data removal more efficiently. Despite the growing research interest and recent advancements, existing LLM unlearning methods often lack formal guarantees of effectiveness. While some approaches, such as locate-then-unlearn, enhance interpretability by identifying and modifying specific model components, they do not establish a rigorous theoretical foundation for their efficacy. This proposal aims to bridge this critical gap by developing a comprehensive theoretical framework for LLM unlearning.</w:t>
+        <w:t xml:space="preserve">To address these critical challenges, the field of LLM unlearning has emerged, aiming to remove specific information or behaviors from models while preserving their overall performance. Unlike traditional approaches that necessitate costly and time-consuming full model retraining, LLM unlearning seeks to achieve targeted data removal more efficiently. Despite the growing research interest and recent advancements, existing LLM unlearning methods often lack formal guarantees of effectiveness. While some approaches, such as </w:t>
+      </w:r>
+      <w:r>
+        <w:lastRenderedPageBreak/>
+        <w:t>locate-then-unlearn, enhance interpretability by identifying and modifying specific model components, they do not establish a rigorous theoretical foundation for their efficacy. This proposal aims to bridge this critical gap by developing a comprehensive theoretical framework for LLM unlearning.</w:t>
       </w:r>
     </w:p>
     <w:p>
@@ -24721,129 +24574,129 @@
       </w:pPr>
       <w:bookmarkStart w:id="88" w:name="_Toc206437483"/>
       <w:r>
+        <w:t>2.</w:t>
+      </w:r>
+      <w:r>
+        <w:t>Gap</w:t>
+      </w:r>
+      <w:bookmarkEnd w:id="88"/>
+    </w:p>
+    <w:p>
+      <w:pPr>
+        <w:jc w:val="both"/>
+      </w:pPr>
+      <w:r>
+        <w:rPr>
+          <w:b/>
+          <w:bCs/>
+        </w:rPr>
+        <w:t>Theoretical framework</w:t>
+      </w:r>
+      <w:r>
+        <w:rPr>
+          <w:rStyle w:val="Heading2Char"/>
+        </w:rPr>
+        <w:t xml:space="preserve"> </w:t>
+      </w:r>
+      <w:r>
+        <w:t>[6]</w:t>
+      </w:r>
+      <w:r>
+        <w:t xml:space="preserve"> Existing LLM unlearning methods often lack formal </w:t>
+      </w:r>
+      <w:proofErr w:type="gramStart"/>
+      <w:r>
+        <w:t xml:space="preserve">guarantees </w:t>
+      </w:r>
+      <w:r>
+        <w:t xml:space="preserve"> </w:t>
+      </w:r>
+      <w:r>
+        <w:t>of</w:t>
+      </w:r>
+      <w:proofErr w:type="gramEnd"/>
+      <w:r>
+        <w:t xml:space="preserve"> effectiveness. While locate-then-unlearn approaches [</w:t>
+      </w:r>
+      <w:r>
+        <w:t xml:space="preserve">[13] </w:t>
+      </w:r>
+      <w:r>
+        <w:t xml:space="preserve">Wu et al., </w:t>
+      </w:r>
+      <w:r>
+        <w:t xml:space="preserve">[14] </w:t>
+      </w:r>
+      <w:r>
+        <w:t>2023; Jia et al., 2024] enhance interpretability, they do not establish a rigorous theoretical foundation. A crucial future direction is to develop a comprehensive framework that formally defines and ensures its effectiveness. This could involve leveraging principles from information theory [</w:t>
+      </w:r>
+      <w:r>
+        <w:t xml:space="preserve">[14] </w:t>
+      </w:r>
+      <w:r>
+        <w:t>Jeon et al., 2024] and other theoretical approaches to pro</w:t>
+      </w:r>
+      <w:r>
+        <w:t>vide a more principled understanding of LLM unlearning</w:t>
+      </w:r>
+      <w:r>
+        <w:t>.</w:t>
+      </w:r>
+    </w:p>
+    <w:p>
+      <w:pPr>
+        <w:jc w:val="both"/>
+      </w:pPr>
+      <w:r>
+        <w:rPr>
+          <w:b/>
+          <w:bCs/>
+        </w:rPr>
+        <w:t>Limited application of FU methods beyond vision tasks</w:t>
+      </w:r>
+      <w:r>
+        <w:t>, current research on FU predominantly focuses on vision tasks—particularly image classification—while overlooking its broader applicability. This narrow focus may stem from the limited exploration of FL with LLMs, as few studies have evaluated FU methods on language tasks or datasets—even with the rise of powerful models like GPT-4. Moreover, only one study to date has utilized a multivariate dataset, highlighting a significant research gap. Expanding FU research beyond vision tasks is both necessary and promising. Incorporating diverse tasks from other domains—such as next-word prediction for personal devices (text) or privacy-sensitive medical analysis (text, image, or multivariate data)—could showcase the true potential of FU in preserving privacy and improving efficiency over retraining</w:t>
+      </w:r>
+      <w:r>
+        <w:t>.</w:t>
+      </w:r>
+    </w:p>
+    <w:p>
+      <w:pPr>
+        <w:jc w:val="both"/>
+      </w:pPr>
+      <w:r>
+        <w:rPr>
+          <w:b/>
+          <w:bCs/>
+        </w:rPr>
+        <w:t>Tighter Analysis</w:t>
+      </w:r>
+      <w:r>
+        <w:rPr>
+          <w:rStyle w:val="Heading3Char"/>
+        </w:rPr>
+        <w:t xml:space="preserve"> </w:t>
+      </w:r>
+      <w:r>
+        <w:t xml:space="preserve">[8] </w:t>
+      </w:r>
+      <w:r>
+        <w:t>challenges for future work remain. (1) The Newton update removal mechanism requires inverting the Hessian matrix, which may be problematic. Methods that approximate the Hessian with near-diagonal matrices may address this problem. (2) Removal from models with non-convex losses is unsupported; it may require local analysis of the loss surface to show that data points do not move the model out of a local optimum. (3) There remains a large gap between our data-dependent bound and the true gradient residual norm, necessitating a tighter analysis. (4) Some applications may require the development of alternative, less constraining notions of data removal.</w:t>
+      </w:r>
+    </w:p>
+    <w:p>
+      <w:pPr>
+        <w:jc w:val="both"/>
+      </w:pPr>
+    </w:p>
+    <w:p>
+      <w:pPr>
+        <w:pStyle w:val="Heading2"/>
+      </w:pPr>
+      <w:bookmarkStart w:id="89" w:name="_Toc206437484"/>
+      <w:r>
         <w:lastRenderedPageBreak/>
-        <w:t>2.</w:t>
-      </w:r>
-      <w:r>
-        <w:t>Gap</w:t>
-      </w:r>
-      <w:bookmarkEnd w:id="88"/>
-    </w:p>
-    <w:p>
-      <w:pPr>
-        <w:jc w:val="both"/>
-      </w:pPr>
-      <w:r>
-        <w:rPr>
-          <w:b/>
-          <w:bCs/>
-        </w:rPr>
-        <w:t>Theoretical framework</w:t>
-      </w:r>
-      <w:r>
-        <w:rPr>
-          <w:rStyle w:val="Heading2Char"/>
-        </w:rPr>
-        <w:t xml:space="preserve"> </w:t>
-      </w:r>
-      <w:r>
-        <w:t>[6]</w:t>
-      </w:r>
-      <w:r>
-        <w:t xml:space="preserve"> Existing LLM unlearning methods often lack formal </w:t>
-      </w:r>
-      <w:proofErr w:type="gramStart"/>
-      <w:r>
-        <w:t xml:space="preserve">guarantees </w:t>
-      </w:r>
-      <w:r>
-        <w:t xml:space="preserve"> </w:t>
-      </w:r>
-      <w:r>
-        <w:t>of</w:t>
-      </w:r>
-      <w:proofErr w:type="gramEnd"/>
-      <w:r>
-        <w:t xml:space="preserve"> effectiveness. While locate-then-unlearn approaches [</w:t>
-      </w:r>
-      <w:r>
-        <w:t xml:space="preserve">[13] </w:t>
-      </w:r>
-      <w:r>
-        <w:t xml:space="preserve">Wu et al., </w:t>
-      </w:r>
-      <w:r>
-        <w:t xml:space="preserve">[14] </w:t>
-      </w:r>
-      <w:r>
-        <w:t>2023; Jia et al., 2024] enhance interpretability, they do not establish a rigorous theoretical foundation. A crucial future direction is to develop a comprehensive framework that formally defines and ensures its effectiveness. This could involve leveraging principles from information theory [</w:t>
-      </w:r>
-      <w:r>
-        <w:t xml:space="preserve">[14] </w:t>
-      </w:r>
-      <w:r>
-        <w:t>Jeon et al., 2024] and other theoretical approaches to pro</w:t>
-      </w:r>
-      <w:r>
-        <w:t>vide a more principled understanding of LLM unlearning</w:t>
-      </w:r>
-      <w:r>
-        <w:t>.</w:t>
-      </w:r>
-    </w:p>
-    <w:p>
-      <w:pPr>
-        <w:jc w:val="both"/>
-      </w:pPr>
-      <w:r>
-        <w:rPr>
-          <w:b/>
-          <w:bCs/>
-        </w:rPr>
-        <w:t>Limited application of FU methods beyond vision tasks</w:t>
-      </w:r>
-      <w:r>
-        <w:t>, current research on FU predominantly focuses on vision tasks—particularly image classification—while overlooking its broader applicability. This narrow focus may stem from the limited exploration of FL with LLMs, as few studies have evaluated FU methods on language tasks or datasets—even with the rise of powerful models like GPT-4. Moreover, only one study to date has utilized a multivariate dataset, highlighting a significant research gap. Expanding FU research beyond vision tasks is both necessary and promising. Incorporating diverse tasks from other domains—such as next-word prediction for personal devices (text) or privacy-sensitive medical analysis (text, image, or multivariate data)—could showcase the true potential of FU in preserving privacy and improving efficiency over retraining</w:t>
-      </w:r>
-      <w:r>
-        <w:t>.</w:t>
-      </w:r>
-    </w:p>
-    <w:p>
-      <w:pPr>
-        <w:jc w:val="both"/>
-      </w:pPr>
-      <w:r>
-        <w:rPr>
-          <w:b/>
-          <w:bCs/>
-        </w:rPr>
-        <w:t>Tighter Analysis</w:t>
-      </w:r>
-      <w:r>
-        <w:rPr>
-          <w:rStyle w:val="Heading3Char"/>
-        </w:rPr>
-        <w:t xml:space="preserve"> </w:t>
-      </w:r>
-      <w:r>
-        <w:t xml:space="preserve">[8] </w:t>
-      </w:r>
-      <w:r>
-        <w:t>challenges for future work remain. (1) The Newton update removal mechanism requires inverting the Hessian matrix, which may be problematic. Methods that approximate the Hessian with near-diagonal matrices may address this problem. (2) Removal from models with non-convex losses is unsupported; it may require local analysis of the loss surface to show that data points do not move the model out of a local optimum. (3) There remains a large gap between our data-dependent bound and the true gradient residual norm, necessitating a tighter analysis. (4) Some applications may require the development of alternative, less constraining notions of data removal.</w:t>
-      </w:r>
-    </w:p>
-    <w:p>
-      <w:pPr>
-        <w:jc w:val="both"/>
-      </w:pPr>
-    </w:p>
-    <w:p>
-      <w:pPr>
-        <w:pStyle w:val="Heading2"/>
-      </w:pPr>
-      <w:bookmarkStart w:id="89" w:name="_Toc206437484"/>
-      <w:r>
         <w:t>3.</w:t>
       </w:r>
       <w:r>
@@ -24894,7 +24747,6 @@
         <w:jc w:val="both"/>
       </w:pPr>
       <w:r>
-        <w:lastRenderedPageBreak/>
         <w:t xml:space="preserve">    ◦ To establish formal criteria and metrics for evaluating both the quality of forgetting and the preservation of utility within LLMs.</w:t>
       </w:r>
     </w:p>
@@ -25031,6 +24883,7 @@
         <w:jc w:val="both"/>
       </w:pPr>
       <w:r>
+        <w:lastRenderedPageBreak/>
         <w:t>    ◦ </w:t>
       </w:r>
       <w:r>
@@ -25065,11 +24918,147 @@
         <w:t>Formal Definitions of Unlearning:</w:t>
       </w:r>
       <w:r>
-        <w:t xml:space="preserve"> Develop rigorous mathematical definitions for "forget efficacy" and "utility preservation" grounded in information-theoretic or statistical concepts. For instance, define "effective unlearning" as a state where the model's behavior </w:t>
+        <w:t> Develop rigorous mathematical definitions for "forget efficacy" and "utility preservation" grounded in information-theoretic or statistical concepts. For instance, define "effective unlearning" as a state where the model's behavior or internal representations related to the forgotten data become statistically indistinguishable from a model that was never exposed to that data.</w:t>
+      </w:r>
+    </w:p>
+    <w:p>
+      <w:pPr>
+        <w:jc w:val="both"/>
+      </w:pPr>
+      <w:r>
+        <w:t>    ◦ </w:t>
+      </w:r>
+      <w:r>
+        <w:rPr>
+          <w:b/>
+          <w:bCs/>
+        </w:rPr>
+        <w:t>Formalizing Trade-offs:</w:t>
+      </w:r>
+      <w:r>
+        <w:t> Model the inherent trade-off between effectively forgetting undesired information and preserving the model's utility (as expressed by the regularization parameter λ in the existing optimization objective min θ {−</w:t>
+      </w:r>
+      <w:proofErr w:type="spellStart"/>
+      <w:r>
+        <w:t>Lf</w:t>
+      </w:r>
+      <w:proofErr w:type="spellEnd"/>
+      <w:r>
+        <w:t xml:space="preserve"> (θ) + </w:t>
+      </w:r>
+      <w:proofErr w:type="spellStart"/>
+      <w:r>
+        <w:t>λLr</w:t>
+      </w:r>
+      <w:proofErr w:type="spellEnd"/>
+      <w:r>
+        <w:t>(θ)}) using formal mathematical frameworks.</w:t>
+      </w:r>
+    </w:p>
+    <w:p>
+      <w:pPr>
+        <w:jc w:val="both"/>
+      </w:pPr>
+      <w:r>
+        <w:t>• </w:t>
+      </w:r>
+      <w:r>
+        <w:rPr>
+          <w:b/>
+          <w:bCs/>
+        </w:rPr>
+        <w:t>4.3. Development of Formal Verification Mechanisms:</w:t>
+      </w:r>
+    </w:p>
+    <w:p>
+      <w:pPr>
+        <w:jc w:val="both"/>
+      </w:pPr>
+      <w:r>
+        <w:t>    ◦ </w:t>
+      </w:r>
+      <w:r>
+        <w:rPr>
+          <w:b/>
+          <w:bCs/>
+        </w:rPr>
+        <w:t>Provable Guarantees:</w:t>
+      </w:r>
+      <w:r>
+        <w:t> Propose theoretical frameworks for providing provable guarantees of unlearning, potentially drawing inspiration from areas like differential privacy, where privacy guarantees are formally defined. While not explicitly mentioned in the source as a method, the regulatory context of GDPR implies a need for robust, auditable mechanisms.</w:t>
+      </w:r>
+    </w:p>
+    <w:p>
+      <w:pPr>
+        <w:jc w:val="both"/>
+      </w:pPr>
+      <w:r>
+        <w:t>    ◦ </w:t>
+      </w:r>
+      <w:r>
+        <w:rPr>
+          <w:b/>
+          <w:bCs/>
+        </w:rPr>
+        <w:t>Adversarial Robustness:</w:t>
+      </w:r>
+      <w:r>
+        <w:t> Incorporate insights from adversarial attacks (e.g., in-context relearning, jailbreak prompts, Membership Inference Attacks) into the theoretical framework. The framework should aim to explain why certain unlearning methods are susceptible to these attacks and provide guidelines for designing robust unlearning strategies.</w:t>
+      </w:r>
+    </w:p>
+    <w:p>
+      <w:pPr>
+        <w:jc w:val="both"/>
+      </w:pPr>
+      <w:r>
+        <w:t>    ◦ </w:t>
+      </w:r>
+      <w:r>
+        <w:rPr>
+          <w:b/>
+          <w:bCs/>
+        </w:rPr>
+        <w:t>Causal Mechanisms:</w:t>
+      </w:r>
+      <w:r>
+        <w:t> Integrate concepts from causal inference, as seen in mechanistic unlearning approaches (e.g., fact lookup localization, path patching), to formally describe the causal relationship between specific data, model parameters, and outputs. This can lead to a more rigorous understanding of how to "break" these causal links for effective unlearning.</w:t>
+      </w:r>
+    </w:p>
+    <w:p>
+      <w:pPr>
+        <w:jc w:val="both"/>
+      </w:pPr>
+      <w:r>
+        <w:t>• </w:t>
+      </w:r>
+      <w:r>
+        <w:rPr>
+          <w:b/>
+          <w:bCs/>
+        </w:rPr>
+        <w:t>4.4. Conceptual Application and Validation:</w:t>
+      </w:r>
+    </w:p>
+    <w:p>
+      <w:pPr>
+        <w:jc w:val="both"/>
+      </w:pPr>
+      <w:r>
+        <w:t>    ◦ </w:t>
+      </w:r>
+      <w:r>
+        <w:rPr>
+          <w:b/>
+          <w:bCs/>
+        </w:rPr>
+        <w:t>Case Studies:</w:t>
+      </w:r>
+      <w:r>
+        <w:t xml:space="preserve"> Apply the developed theoretical framework to analyze the effectiveness and limitations of a selection of prominent existing unlearning methods (e.g., Preference </w:t>
       </w:r>
       <w:r>
         <w:lastRenderedPageBreak/>
-        <w:t>or internal representations related to the forgotten data become statistically indistinguishable from a model that was never exposed to that data.</w:t>
+        <w:t>Optimization, Representation Engineering, Contrastive Decoding) from a formal perspective.</w:t>
       </w:r>
     </w:p>
     <w:p>
@@ -25084,26 +25073,114 @@
           <w:b/>
           <w:bCs/>
         </w:rPr>
-        <w:t>Formalizing Trade-offs:</w:t>
-      </w:r>
-      <w:r>
-        <w:t> Model the inherent trade-off between effectively forgetting undesired information and preserving the model's utility (as expressed by the regularization parameter λ in the existing optimization objective min θ {−</w:t>
+        <w:t>Proof of Concept:</w:t>
+      </w:r>
+      <w:r>
+        <w:t> While primarily theoretical, illustrate how the framework can guide the design of new, more theoretically sound unlearning algorithms or improve existing ones. This might involve demonstrating how the framework helps identify specific vulnerabilities or optimize unlearning parameters.</w:t>
+      </w:r>
+    </w:p>
+    <w:p>
+      <w:pPr>
+        <w:pStyle w:val="Heading2"/>
+      </w:pPr>
+      <w:bookmarkStart w:id="91" w:name="_Toc206437486"/>
+      <w:r>
+        <w:rPr>
+          <w:rStyle w:val="Heading2Char"/>
+        </w:rPr>
+        <w:t>5.</w:t>
+      </w:r>
+      <w:r>
+        <w:rPr>
+          <w:rStyle w:val="Heading2Char"/>
+        </w:rPr>
+        <w:t>Data Collection Methods</w:t>
+      </w:r>
+      <w:bookmarkEnd w:id="91"/>
+      <w:r>
+        <w:t> </w:t>
+      </w:r>
+    </w:p>
+    <w:p>
+      <w:pPr>
+        <w:jc w:val="both"/>
+      </w:pPr>
+      <w:r>
+        <w:t>This research is primarily theoretical and analytical, thus traditional "data collection" in the empirical sense will not be the main focus. Instead, it will rely on:</w:t>
+      </w:r>
+    </w:p>
+    <w:p>
+      <w:pPr>
+        <w:jc w:val="both"/>
+      </w:pPr>
+      <w:r>
+        <w:t>• </w:t>
+      </w:r>
+      <w:r>
+        <w:rPr>
+          <w:b/>
+          <w:bCs/>
+        </w:rPr>
+        <w:t>Existing Academic Literature:</w:t>
+      </w:r>
+      <w:r>
+        <w:t> Extensive collection and analysis of published research on machine unlearning, LLMs, information theory, privacy-preserving AI, and related fields (as indicated by the numerous citations in the source).</w:t>
+      </w:r>
+    </w:p>
+    <w:p>
+      <w:pPr>
+        <w:jc w:val="both"/>
+      </w:pPr>
+      <w:r>
+        <w:t>• </w:t>
+      </w:r>
+      <w:r>
+        <w:rPr>
+          <w:b/>
+          <w:bCs/>
+        </w:rPr>
+        <w:t>Publicly Available LLM Unlearning Benchmarks:</w:t>
+      </w:r>
+      <w:r>
+        <w:t xml:space="preserve"> Although the research is theoretical, the proposed framework will be informed by and potentially applied conceptually to existing unimodal benchmarks (e.g., WHP, TOFU, WMDP, RWKU) and multimodal benchmarks (e.g., </w:t>
       </w:r>
       <w:proofErr w:type="spellStart"/>
       <w:r>
-        <w:t>Lf</w:t>
+        <w:t>FIUBench</w:t>
       </w:r>
       <w:proofErr w:type="spellEnd"/>
       <w:r>
-        <w:t xml:space="preserve"> (θ) + </w:t>
-      </w:r>
-      <w:proofErr w:type="spellStart"/>
-      <w:r>
-        <w:t>λLr</w:t>
-      </w:r>
-      <w:proofErr w:type="spellEnd"/>
-      <w:r>
-        <w:t>(θ)}) using formal mathematical frameworks.</w:t>
+        <w:t>, MLLMU-Bench, CLEAR) to ensure its practical relevance and ability to address real-world unlearning scenarios.</w:t>
+      </w:r>
+    </w:p>
+    <w:p>
+      <w:pPr>
+        <w:pStyle w:val="Heading2"/>
+      </w:pPr>
+      <w:bookmarkStart w:id="92" w:name="_Toc206437487"/>
+      <w:r>
+        <w:rPr>
+          <w:rStyle w:val="Heading2Char"/>
+        </w:rPr>
+        <w:t>6.</w:t>
+      </w:r>
+      <w:r>
+        <w:rPr>
+          <w:rStyle w:val="Heading2Char"/>
+        </w:rPr>
+        <w:t>Expected Contribution</w:t>
+      </w:r>
+      <w:bookmarkEnd w:id="92"/>
+      <w:r>
+        <w:t> </w:t>
+      </w:r>
+    </w:p>
+    <w:p>
+      <w:pPr>
+        <w:jc w:val="both"/>
+      </w:pPr>
+      <w:r>
+        <w:t>This research is expected to make several significant contributions to the field of LLM unlearning:</w:t>
       </w:r>
     </w:p>
     <w:p>
@@ -25118,61 +25195,10 @@
           <w:b/>
           <w:bCs/>
         </w:rPr>
-        <w:t>4.3. Development of Formal Verification Mechanisms:</w:t>
-      </w:r>
-    </w:p>
-    <w:p>
-      <w:pPr>
-        <w:jc w:val="both"/>
-      </w:pPr>
-      <w:r>
-        <w:t>    ◦ </w:t>
-      </w:r>
-      <w:r>
-        <w:rPr>
-          <w:b/>
-          <w:bCs/>
-        </w:rPr>
-        <w:t>Provable Guarantees:</w:t>
-      </w:r>
-      <w:r>
-        <w:t> Propose theoretical frameworks for providing provable guarantees of unlearning, potentially drawing inspiration from areas like differential privacy, where privacy guarantees are formally defined. While not explicitly mentioned in the source as a method, the regulatory context of GDPR implies a need for robust, auditable mechanisms.</w:t>
-      </w:r>
-    </w:p>
-    <w:p>
-      <w:pPr>
-        <w:jc w:val="both"/>
-      </w:pPr>
-      <w:r>
-        <w:t>    ◦ </w:t>
-      </w:r>
-      <w:r>
-        <w:rPr>
-          <w:b/>
-          <w:bCs/>
-        </w:rPr>
-        <w:t>Adversarial Robustness:</w:t>
-      </w:r>
-      <w:r>
-        <w:t> Incorporate insights from adversarial attacks (e.g., in-context relearning, jailbreak prompts, Membership Inference Attacks) into the theoretical framework. The framework should aim to explain why certain unlearning methods are susceptible to these attacks and provide guidelines for designing robust unlearning strategies.</w:t>
-      </w:r>
-    </w:p>
-    <w:p>
-      <w:pPr>
-        <w:jc w:val="both"/>
-      </w:pPr>
-      <w:r>
-        <w:t>    ◦ </w:t>
-      </w:r>
-      <w:r>
-        <w:rPr>
-          <w:b/>
-          <w:bCs/>
-        </w:rPr>
-        <w:t>Causal Mechanisms:</w:t>
-      </w:r>
-      <w:r>
-        <w:t> Integrate concepts from causal inference, as seen in mechanistic unlearning approaches (e.g., fact lookup localization, path patching), to formally describe the causal relationship between specific data, model parameters, and outputs. This can lead to a more rigorous understanding of how to "break" these causal links for effective unlearning.</w:t>
+        <w:t>A Novel Theoretical Framework:</w:t>
+      </w:r>
+      <w:r>
+        <w:t> The primary contribution will be a novel, comprehensive theoretical framework that formally defines and ensures the effectiveness of LLM unlearning.</w:t>
       </w:r>
     </w:p>
     <w:p>
@@ -25187,74 +25213,10 @@
           <w:b/>
           <w:bCs/>
         </w:rPr>
-        <w:t>4.4. Conceptual Application and Validation:</w:t>
-      </w:r>
-    </w:p>
-    <w:p>
-      <w:pPr>
-        <w:jc w:val="both"/>
-      </w:pPr>
-      <w:r>
-        <w:t>    ◦ </w:t>
-      </w:r>
-      <w:r>
-        <w:rPr>
-          <w:b/>
-          <w:bCs/>
-        </w:rPr>
-        <w:t>Case Studies:</w:t>
-      </w:r>
-      <w:r>
-        <w:t> Apply the developed theoretical framework to analyze the effectiveness and limitations of a selection of prominent existing unlearning methods (e.g., Preference Optimization, Representation Engineering, Contrastive Decoding) from a formal perspective.</w:t>
-      </w:r>
-    </w:p>
-    <w:p>
-      <w:pPr>
-        <w:jc w:val="both"/>
-      </w:pPr>
-      <w:r>
-        <w:t>    ◦ </w:t>
-      </w:r>
-      <w:r>
-        <w:rPr>
-          <w:b/>
-          <w:bCs/>
-        </w:rPr>
-        <w:t>Proof of Concept:</w:t>
-      </w:r>
-      <w:r>
-        <w:t> While primarily theoretical, illustrate how the framework can guide the design of new, more theoretically sound unlearning algorithms or improve existing ones. This might involve demonstrating how the framework helps identify specific vulnerabilities or optimize unlearning parameters.</w:t>
-      </w:r>
-    </w:p>
-    <w:p>
-      <w:pPr>
-        <w:pStyle w:val="Heading2"/>
-      </w:pPr>
-      <w:bookmarkStart w:id="91" w:name="_Toc206437486"/>
-      <w:r>
-        <w:rPr>
-          <w:rStyle w:val="Heading2Char"/>
-        </w:rPr>
-        <w:lastRenderedPageBreak/>
-        <w:t>5.</w:t>
-      </w:r>
-      <w:r>
-        <w:rPr>
-          <w:rStyle w:val="Heading2Char"/>
-        </w:rPr>
-        <w:t>Data Collection Methods</w:t>
-      </w:r>
-      <w:bookmarkEnd w:id="91"/>
-      <w:r>
-        <w:t> </w:t>
-      </w:r>
-    </w:p>
-    <w:p>
-      <w:pPr>
-        <w:jc w:val="both"/>
-      </w:pPr>
-      <w:r>
-        <w:t>This research is primarily theoretical and analytical, thus traditional "data collection" in the empirical sense will not be the main focus. Instead, it will rely on:</w:t>
+        <w:t>Formal Guarantees:</w:t>
+      </w:r>
+      <w:r>
+        <w:t> Provide the first steps towards establishing formal guarantees for unlearning efficacy and utility preservation, moving beyond empirical observations.</w:t>
       </w:r>
     </w:p>
     <w:p>
@@ -25269,10 +25231,10 @@
           <w:b/>
           <w:bCs/>
         </w:rPr>
-        <w:t>Existing Academic Literature:</w:t>
-      </w:r>
-      <w:r>
-        <w:t> Extensive collection and analysis of published research on machine unlearning, LLMs, information theory, privacy-preserving AI, and related fields (as indicated by the numerous citations in the source).</w:t>
+        <w:t>Principled Understanding:</w:t>
+      </w:r>
+      <w:r>
+        <w:t> Offer a more principled and rigorous understanding of how knowledge is acquired, stored, and subsequently removed from LLMs.</w:t>
       </w:r>
     </w:p>
     <w:p>
@@ -25287,168 +25249,10 @@
           <w:b/>
           <w:bCs/>
         </w:rPr>
-        <w:t>Publicly Available LLM Unlearning Benchmarks:</w:t>
-      </w:r>
-      <w:r>
-        <w:t xml:space="preserve"> Although the research is theoretical, the proposed framework will be informed by and potentially applied conceptually to existing unimodal benchmarks (e.g., WHP, TOFU, WMDP, RWKU) and multimodal benchmarks (e.g., </w:t>
-      </w:r>
-      <w:proofErr w:type="spellStart"/>
-      <w:r>
-        <w:t>FIUBench</w:t>
-      </w:r>
-      <w:proofErr w:type="spellEnd"/>
-      <w:r>
-        <w:t>, MLLMU-Bench, CLEAR) to ensure its practical relevance and ability to address real-world unlearning scenarios.</w:t>
-      </w:r>
-    </w:p>
-    <w:p>
-      <w:pPr>
-        <w:pStyle w:val="Heading2"/>
-      </w:pPr>
-      <w:bookmarkStart w:id="92" w:name="_Toc206437487"/>
-      <w:r>
-        <w:rPr>
-          <w:rStyle w:val="Heading2Char"/>
-        </w:rPr>
-        <w:t>6.</w:t>
-      </w:r>
-      <w:r>
-        <w:rPr>
-          <w:rStyle w:val="Heading2Char"/>
-        </w:rPr>
-        <w:t>Expected Contribution</w:t>
-      </w:r>
-      <w:bookmarkEnd w:id="92"/>
-      <w:r>
-        <w:t> </w:t>
-      </w:r>
-    </w:p>
-    <w:p>
-      <w:pPr>
-        <w:jc w:val="both"/>
-      </w:pPr>
-      <w:r>
-        <w:t>This research is expected to make several significant contributions to the field of LLM unlearning:</w:t>
-      </w:r>
-    </w:p>
-    <w:p>
-      <w:pPr>
-        <w:jc w:val="both"/>
-      </w:pPr>
-      <w:r>
-        <w:t>• </w:t>
-      </w:r>
-      <w:r>
-        <w:rPr>
-          <w:b/>
-          <w:bCs/>
-        </w:rPr>
-        <w:t>A Novel Theoretical Framework:</w:t>
-      </w:r>
-      <w:r>
-        <w:t> The primary contribution will be a novel, comprehensive theoretical framework that formally defines and ensures the effectiveness of LLM unlearning.</w:t>
-      </w:r>
-    </w:p>
-    <w:p>
-      <w:pPr>
-        <w:jc w:val="both"/>
-      </w:pPr>
-      <w:r>
-        <w:t>• </w:t>
-      </w:r>
-      <w:r>
-        <w:rPr>
-          <w:b/>
-          <w:bCs/>
-        </w:rPr>
-        <w:t>Formal Guarantees:</w:t>
-      </w:r>
-      <w:r>
-        <w:t> Provide the first steps towards establishing formal guarantees for unlearning efficacy and utility preservation, moving beyond empirical observations.</w:t>
-      </w:r>
-    </w:p>
-    <w:p>
-      <w:pPr>
-        <w:jc w:val="both"/>
-      </w:pPr>
-      <w:r>
-        <w:t>• </w:t>
-      </w:r>
-      <w:r>
-        <w:rPr>
-          <w:b/>
-          <w:bCs/>
-        </w:rPr>
-        <w:t>Principled Understanding:</w:t>
-      </w:r>
-      <w:r>
-        <w:t> Offer a more principled and rigorous understanding of how knowledge is acquired, stored, and subsequently removed from LLMs.</w:t>
-      </w:r>
-    </w:p>
-    <w:p>
-      <w:pPr>
-        <w:jc w:val="both"/>
-      </w:pPr>
-      <w:r>
-        <w:t>• </w:t>
-      </w:r>
-      <w:r>
-        <w:rPr>
-          <w:b/>
-          <w:bCs/>
-        </w:rPr>
         <w:t>Guidance for Algorithm Design:</w:t>
       </w:r>
       <w:r>
         <w:t> The framework will serve as a guiding principle for the development of future unlearning algorithms that are not only effective but also provably robust against relearning and adversarial attacks.</w:t>
-      </w:r>
-    </w:p>
-    <w:p>
-      <w:pPr>
-        <w:jc w:val="both"/>
-      </w:pPr>
-      <w:r>
-        <w:t>• </w:t>
-      </w:r>
-      <w:r>
-        <w:rPr>
-          <w:b/>
-          <w:bCs/>
-        </w:rPr>
-        <w:t>Enhanced Reliability and Trust:</w:t>
-      </w:r>
-      <w:r>
-        <w:t> By providing formal underpinnings, the research will contribute to building more reliable and trustworthy AI systems, better equipped to comply with privacy regulations like GDPR and the EU AI Act.</w:t>
-      </w:r>
-    </w:p>
-    <w:p>
-      <w:pPr>
-        <w:pStyle w:val="Heading2"/>
-      </w:pPr>
-      <w:bookmarkStart w:id="93" w:name="_Toc206437488"/>
-      <w:r>
-        <w:rPr>
-          <w:rStyle w:val="Heading2Char"/>
-        </w:rPr>
-        <w:t>7.</w:t>
-      </w:r>
-      <w:r>
-        <w:rPr>
-          <w:rStyle w:val="Heading2Char"/>
-        </w:rPr>
-        <w:t>Anticipated Results</w:t>
-      </w:r>
-      <w:bookmarkEnd w:id="93"/>
-      <w:r>
-        <w:t> </w:t>
-      </w:r>
-    </w:p>
-    <w:p>
-      <w:pPr>
-        <w:jc w:val="both"/>
-      </w:pPr>
-      <w:r>
-        <w:t>We anticipate the following results from this research:</w:t>
       </w:r>
     </w:p>
     <w:p>
@@ -25464,6 +25268,54 @@
           <w:b/>
           <w:bCs/>
         </w:rPr>
+        <w:t>Enhanced Reliability and Trust:</w:t>
+      </w:r>
+      <w:r>
+        <w:t> By providing formal underpinnings, the research will contribute to building more reliable and trustworthy AI systems, better equipped to comply with privacy regulations like GDPR and the EU AI Act.</w:t>
+      </w:r>
+    </w:p>
+    <w:p>
+      <w:pPr>
+        <w:pStyle w:val="Heading2"/>
+      </w:pPr>
+      <w:bookmarkStart w:id="93" w:name="_Toc206437488"/>
+      <w:r>
+        <w:rPr>
+          <w:rStyle w:val="Heading2Char"/>
+        </w:rPr>
+        <w:t>7.</w:t>
+      </w:r>
+      <w:r>
+        <w:rPr>
+          <w:rStyle w:val="Heading2Char"/>
+        </w:rPr>
+        <w:t>Anticipated Results</w:t>
+      </w:r>
+      <w:bookmarkEnd w:id="93"/>
+      <w:r>
+        <w:t> </w:t>
+      </w:r>
+    </w:p>
+    <w:p>
+      <w:pPr>
+        <w:jc w:val="both"/>
+      </w:pPr>
+      <w:r>
+        <w:t>We anticipate the following results from this research:</w:t>
+      </w:r>
+    </w:p>
+    <w:p>
+      <w:pPr>
+        <w:jc w:val="both"/>
+      </w:pPr>
+      <w:r>
+        <w:t>• </w:t>
+      </w:r>
+      <w:r>
+        <w:rPr>
+          <w:b/>
+          <w:bCs/>
+        </w:rPr>
         <w:t>Formal Definitions and Models:</w:t>
       </w:r>
       <w:r>
@@ -25503,15 +25355,7 @@
         <w:t>Vulnerability Identification:</w:t>
       </w:r>
       <w:r>
-        <w:t xml:space="preserve"> A theoretical explanation for why certain existing unlearning methods </w:t>
-      </w:r>
-      <w:proofErr w:type="gramStart"/>
-      <w:r>
-        <w:t>are</w:t>
-      </w:r>
-      <w:proofErr w:type="gramEnd"/>
-      <w:r>
-        <w:t xml:space="preserve"> susceptible to knowledge recovery or performance degradation.</w:t>
+        <w:t> A theoretical explanation for why certain existing unlearning methods are susceptible to knowledge recovery or performance degradation.</w:t>
       </w:r>
     </w:p>
     <w:p>
@@ -25655,6 +25499,7 @@
         <w:jc w:val="both"/>
       </w:pPr>
       <w:r>
+        <w:lastRenderedPageBreak/>
         <w:t>• </w:t>
       </w:r>
       <w:r>
@@ -25681,7 +25526,6 @@
         <w:rPr>
           <w:rStyle w:val="Heading2Char"/>
         </w:rPr>
-        <w:lastRenderedPageBreak/>
         <w:t>Conclusion</w:t>
       </w:r>
       <w:bookmarkEnd w:id="95"/>
@@ -25809,6 +25653,7 @@
       </w:pPr>
       <w:bookmarkStart w:id="97" w:name="_Toc206437492"/>
       <w:r>
+        <w:lastRenderedPageBreak/>
         <w:t>4.</w:t>
       </w:r>
       <w:r>
@@ -25930,38 +25775,7 @@
         <w:t>.</w:t>
       </w:r>
       <w:r>
-        <w:t xml:space="preserve"> In real-world applications, un</w:t>
-      </w:r>
-      <w:r>
-        <w:t xml:space="preserve">learning requests from different users often arrive sequentially. However, traditional recommendation </w:t>
-      </w:r>
-      <w:r>
-        <w:lastRenderedPageBreak/>
-        <w:t xml:space="preserve">unlearning methods process requests in batch mode, which, while effective in certain contexts, is impractical in dynamic environments where responsiveness is critical. In this sequential setting, exact unlearning, which requires </w:t>
-      </w:r>
-      <w:proofErr w:type="spellStart"/>
-      <w:r>
-        <w:t>fre</w:t>
-      </w:r>
-      <w:proofErr w:type="spellEnd"/>
-      <w:r>
-        <w:t/>
-      </w:r>
-      <w:proofErr w:type="spellStart"/>
-      <w:r>
-        <w:t>quent</w:t>
-      </w:r>
-      <w:proofErr w:type="spellEnd"/>
-      <w:r>
-        <w:t xml:space="preserve"> model retraining, becomes inefficient and may essentially be reduced to a condition where they must be retrained from scratch. On the other hand, </w:t>
-      </w:r>
-      <w:proofErr w:type="spellStart"/>
-      <w:r>
-        <w:t>approxi</w:t>
-      </w:r>
-      <w:proofErr w:type="spellEnd"/>
-      <w:r>
-        <w:t xml:space="preserve">mate unlearning faces a unique challenge in sequential settings: the estimation gap becomes more pronounced over time, making it more difficult to maintain utility and completeness in the recommendations. Therefore, the scenario of sequential unlearning remains worthy of further investigation. </w:t>
+        <w:t xml:space="preserve"> In real-world applications, unlearning requests from different users often arrive sequentially. However, traditional recommendation unlearning methods process requests in batch mode, which, while effective in certain contexts, is impractical in dynamic environments where responsiveness is critical. In this sequential setting, exact unlearning, which requires frequent model retraining, becomes inefficient and may essentially be reduced to a condition where they must be retrained from scratch. On the other hand, approximate unlearning faces a unique challenge in sequential settings: the estimation gap becomes more pronounced over time, making it more difficult to maintain utility and completeness in the recommendations. Therefore, the scenario of sequential unlearning remains worthy of further investigation. </w:t>
       </w:r>
     </w:p>
     <w:p>
@@ -25976,6 +25790,7 @@
         </w:rPr>
       </w:pPr>
       <w:r>
+        <w:lastRenderedPageBreak/>
         <w:t xml:space="preserve">• </w:t>
       </w:r>
       <w:r>
@@ -26099,7 +25914,6 @@
         <w:jc w:val="both"/>
       </w:pPr>
       <w:r>
-        <w:lastRenderedPageBreak/>
         <w:t>    ◦ To analyze the trade-offs between unlearning completeness, efficiency, and model utility, particularly in the context of these challenging scenarios.</w:t>
       </w:r>
     </w:p>
@@ -26150,6 +25964,7 @@
           <w:b/>
           <w:bCs/>
         </w:rPr>
+        <w:lastRenderedPageBreak/>
         <w:t>A. Sequential Unlearning</w:t>
       </w:r>
     </w:p>
@@ -26327,7 +26142,11 @@
       </w:r>
       <w:proofErr w:type="spellEnd"/>
       <w:r>
-        <w:t>, requires "reformulating the learning process", their efficiency gains come from retraining only a subset of data. The challenge is when unlearning requests are truly sequential and scattered across subsets, potentially reducing efficiency gains.</w:t>
+        <w:t xml:space="preserve">, requires "reformulating the learning process", their efficiency gains come from retraining only a subset of data. The challenge is when unlearning </w:t>
+      </w:r>
+      <w:r>
+        <w:lastRenderedPageBreak/>
+        <w:t>requests are truly sequential and scattered across subsets, potentially reducing efficiency gains.</w:t>
       </w:r>
     </w:p>
     <w:p>
@@ -26520,6 +26339,7 @@
         <w:jc w:val="both"/>
       </w:pPr>
       <w:r>
+        <w:lastRenderedPageBreak/>
         <w:t>        ▪ </w:t>
       </w:r>
       <w:r>
@@ -26673,7 +26493,11 @@
         <w:t>B.2.3. Attribute Unlearning from User's Perspective:</w:t>
       </w:r>
       <w:r>
-        <w:t> For attribute unlearning, where users might want to "forget" a specific inferred attribute (e.g., gender, age) that was never explicitly part of training data but can be inferred, explore ways users can request this. This could involve user-side manipulation of embeddings or adversarial training at the client level, inspired by in-training or post-training attribute unlearning methods. The challenge is to maintain model utility for recommendations while making the attribute indistinguishable to attackers.</w:t>
+        <w:t xml:space="preserve"> For attribute unlearning, where users might want to "forget" a specific inferred attribute (e.g., gender, age) that was never explicitly part of training data but can be inferred, explore ways users can </w:t>
+      </w:r>
+      <w:r>
+        <w:lastRenderedPageBreak/>
+        <w:t>request this. This could involve user-side manipulation of embeddings or adversarial training at the client level, inspired by in-training or post-training attribute unlearning methods. The challenge is to maintain model utility for recommendations while making the attribute indistinguishable to attackers.</w:t>
       </w:r>
     </w:p>
     <w:p>
@@ -26927,16 +26751,16 @@
         <w:jc w:val="both"/>
       </w:pPr>
       <w:r>
+        <w:t>.</w:t>
+      </w:r>
+    </w:p>
+    <w:p>
+      <w:pPr>
+        <w:pStyle w:val="Heading2"/>
+      </w:pPr>
+      <w:bookmarkStart w:id="104" w:name="_Toc206437499"/>
+      <w:r>
         <w:lastRenderedPageBreak/>
-        <w:t>.</w:t>
-      </w:r>
-    </w:p>
-    <w:p>
-      <w:pPr>
-        <w:pStyle w:val="Heading2"/>
-      </w:pPr>
-      <w:bookmarkStart w:id="104" w:name="_Toc206437499"/>
-      <w:r>
         <w:t>6. Expected Contributions</w:t>
       </w:r>
       <w:bookmarkEnd w:id="104"/>
@@ -30077,39 +29901,23 @@
         <w:t>3</w:t>
       </w:r>
       <w:r>
-        <w:t xml:space="preserve">] Stefanos </w:t>
+        <w:t xml:space="preserve">] Stefanos Leonardos and Georgios </w:t>
       </w:r>
       <w:proofErr w:type="spellStart"/>
       <w:r>
-        <w:t>Leonardos</w:t>
+        <w:t>Piliouras</w:t>
       </w:r>
       <w:proofErr w:type="spellEnd"/>
       <w:r>
-        <w:t xml:space="preserve"> and Georgios </w:t>
+        <w:t xml:space="preserve">. 2022. Exploration-exploitation in multi-agent learning: Catastrophe theory meets game theory. </w:t>
       </w:r>
       <w:proofErr w:type="spellStart"/>
       <w:r>
-        <w:t>Piliouras</w:t>
+        <w:t>Artif</w:t>
       </w:r>
       <w:proofErr w:type="spellEnd"/>
       <w:r>
-        <w:t xml:space="preserve">. 2022. Exploration-exploitation in multi-agent learning: Catastrophe theory meets game theory. </w:t>
-      </w:r>
-      <w:proofErr w:type="spellStart"/>
-      <w:r>
-        <w:t>Artif</w:t>
-      </w:r>
-      <w:proofErr w:type="spellEnd"/>
-      <w:r>
-        <w:t xml:space="preserve">. </w:t>
-      </w:r>
-      <w:proofErr w:type="spellStart"/>
-      <w:r>
-        <w:t>Intell</w:t>
-      </w:r>
-      <w:proofErr w:type="spellEnd"/>
-      <w:r>
-        <w:t xml:space="preserve">. 304 (2022), 103653. </w:t>
+        <w:t xml:space="preserve">. Intell. 304 (2022), 103653. </w:t>
       </w:r>
       <w:proofErr w:type="spellStart"/>
       <w:proofErr w:type="gramStart"/>
@@ -30136,39 +29944,7 @@
         <w:t>4</w:t>
       </w:r>
       <w:r>
-        <w:t xml:space="preserve">] Lei Cui, </w:t>
-      </w:r>
-      <w:proofErr w:type="spellStart"/>
-      <w:r>
-        <w:t>Youyang</w:t>
-      </w:r>
-      <w:proofErr w:type="spellEnd"/>
-      <w:r>
-        <w:t xml:space="preserve"> Qu, Mohammad Reza </w:t>
-      </w:r>
-      <w:proofErr w:type="spellStart"/>
-      <w:r>
-        <w:t>Nosouhi</w:t>
-      </w:r>
-      <w:proofErr w:type="spellEnd"/>
-      <w:r>
-        <w:t xml:space="preserve">, Shui Yu, </w:t>
-      </w:r>
-      <w:proofErr w:type="spellStart"/>
-      <w:r>
-        <w:t>Jianwei</w:t>
-      </w:r>
-      <w:proofErr w:type="spellEnd"/>
-      <w:r>
-        <w:t xml:space="preserve"> </w:t>
-      </w:r>
-      <w:proofErr w:type="spellStart"/>
-      <w:r>
-        <w:t>Niu</w:t>
-      </w:r>
-      <w:proofErr w:type="spellEnd"/>
-      <w:r>
-        <w:t xml:space="preserve">, and Gang Xie. 2019. Improving data utility through game theory in personalized differential privacy. J. </w:t>
+        <w:t xml:space="preserve">] Lei Cui, Youyang Qu, Mohammad Reza Nosouhi, Shui Yu, Jianwei Niu, and Gang Xie. 2019. Improving data utility through game theory in personalized differential privacy. J. </w:t>
       </w:r>
       <w:proofErr w:type="spellStart"/>
       <w:r>
@@ -30200,23 +29976,7 @@
         <w:t>5</w:t>
       </w:r>
       <w:r>
-        <w:t xml:space="preserve">] </w:t>
-      </w:r>
-      <w:proofErr w:type="spellStart"/>
-      <w:r>
-        <w:t>Xueqin</w:t>
-      </w:r>
-      <w:proofErr w:type="spellEnd"/>
-      <w:r>
-        <w:t xml:space="preserve"> Liang, Zheng Yan, Robert H. Deng, and </w:t>
-      </w:r>
-      <w:proofErr w:type="spellStart"/>
-      <w:r>
-        <w:t>Qinghua</w:t>
-      </w:r>
-      <w:proofErr w:type="spellEnd"/>
-      <w:r>
-        <w:t xml:space="preserve"> Zheng. 2021. Investigating the adoption of hybrid encrypted cloud data deduplication with game theory. IEEE Trans. Parallel </w:t>
+        <w:t xml:space="preserve">] Xueqin Liang, Zheng Yan, Robert H. Deng, and Qinghua Zheng. 2021. Investigating the adoption of hybrid encrypted cloud data deduplication with game theory. IEEE Trans. Parallel </w:t>
       </w:r>
       <w:proofErr w:type="spellStart"/>
       <w:r>
@@ -30361,38 +30121,30 @@
       </w:r>
       <w:proofErr w:type="spellEnd"/>
       <w:r>
-        <w:t xml:space="preserve"> Yang, Student Member, IEEE, </w:t>
+        <w:t xml:space="preserve"> Yang, Student Member, IEEE, Yiling Tao, Student Member, IEEE, </w:t>
       </w:r>
       <w:proofErr w:type="spellStart"/>
       <w:r>
-        <w:t>Yiling</w:t>
+        <w:t>Lixu</w:t>
       </w:r>
       <w:proofErr w:type="spellEnd"/>
       <w:r>
-        <w:t xml:space="preserve"> Tao, Student Member, IEEE, </w:t>
+        <w:t xml:space="preserve"> Wang, Student Member, IEEE, </w:t>
       </w:r>
       <w:proofErr w:type="spellStart"/>
       <w:r>
-        <w:t>Lixu</w:t>
+        <w:t>Xiaoxiao</w:t>
       </w:r>
       <w:proofErr w:type="spellEnd"/>
       <w:r>
-        <w:t xml:space="preserve"> Wang, Student Member, IEEE, </w:t>
+        <w:t xml:space="preserve"> Li, Member, IEEE, Dusit </w:t>
       </w:r>
       <w:proofErr w:type="spellStart"/>
       <w:r>
-        <w:t>Xiaoxiao</w:t>
+        <w:t>Niyato</w:t>
       </w:r>
       <w:proofErr w:type="spellEnd"/>
       <w:r>
-        <w:t xml:space="preserve"> Li, Member, IEEE, Dusit </w:t>
-      </w:r>
-      <w:proofErr w:type="spellStart"/>
-      <w:r>
-        <w:t>Niyato</w:t>
-      </w:r>
-      <w:proofErr w:type="spellEnd"/>
-      <w:r>
         <w:t>, Fellow, IEEE, and H. Vincent Poor, Life Fellow, IEE</w:t>
       </w:r>
       <w:r>
@@ -30407,15 +30159,7 @@
         <w:t xml:space="preserve">[8] </w:t>
       </w:r>
       <w:r>
-        <w:t xml:space="preserve">Chuan Guo, Tom Goldstein, </w:t>
-      </w:r>
-      <w:proofErr w:type="spellStart"/>
-      <w:r>
-        <w:t>Awni</w:t>
-      </w:r>
-      <w:proofErr w:type="spellEnd"/>
-      <w:r>
-        <w:t xml:space="preserve"> Y. </w:t>
+        <w:t xml:space="preserve">Chuan Guo, Tom Goldstein, Awni Y. </w:t>
       </w:r>
       <w:proofErr w:type="spellStart"/>
       <w:r>
@@ -30470,7 +30214,6 @@
       <w:r>
         <w:t xml:space="preserve"> Ye</w:t>
       </w:r>
-      <w:proofErr w:type="gramStart"/>
       <w:r>
         <w:rPr>
           <w:rFonts w:ascii="Cambria Math" w:hAnsi="Cambria Math" w:cs="Cambria Math"/>
@@ -30478,11 +30221,7 @@
         <w:t>∗</w:t>
       </w:r>
       <w:r>
-        <w:t xml:space="preserve"> ,</w:t>
-      </w:r>
-      <w:proofErr w:type="gramEnd"/>
-      <w:r>
-        <w:t xml:space="preserve"> </w:t>
+        <w:t xml:space="preserve"> , </w:t>
       </w:r>
       <w:proofErr w:type="spellStart"/>
       <w:r>
@@ -30636,15 +30375,7 @@
         <w:t>0</w:t>
       </w:r>
       <w:r>
-        <w:t xml:space="preserve">] </w:t>
-      </w:r>
-      <w:proofErr w:type="spellStart"/>
-      <w:r>
-        <w:t>Xiaofeng</w:t>
-      </w:r>
-      <w:proofErr w:type="spellEnd"/>
-      <w:r>
-        <w:t xml:space="preserve"> Ding, </w:t>
+        <w:t xml:space="preserve">] Xiaofeng Ding, </w:t>
       </w:r>
       <w:proofErr w:type="spellStart"/>
       <w:r>
@@ -30700,15 +30431,7 @@
       </w:r>
       <w:proofErr w:type="spellEnd"/>
       <w:r>
-        <w:t xml:space="preserve"> Ye, Gang Yu, Bin Wang, Yike Wu, </w:t>
-      </w:r>
-      <w:proofErr w:type="spellStart"/>
-      <w:r>
-        <w:t>Jiayuan</w:t>
-      </w:r>
-      <w:proofErr w:type="spellEnd"/>
-      <w:r>
-        <w:t xml:space="preserve"> Fan, and Tao Chen. 2022. Sample-centric feature generation for semi-supervised few-shot learning. IEEE Trans. Image Process. 31 (2022), 2309–2320. </w:t>
+        <w:t xml:space="preserve"> Ye, Gang Yu, Bin Wang, Yike Wu, Jiayuan Fan, and Tao Chen. 2022. Sample-centric feature generation for semi-supervised few-shot learning. IEEE Trans. Image Process. 31 (2022), 2309–2320. </w:t>
       </w:r>
       <w:proofErr w:type="spellStart"/>
       <w:proofErr w:type="gramStart"/>
@@ -30806,13 +30529,18 @@
       </w:r>
       <w:proofErr w:type="spellEnd"/>
       <w:r>
-        <w:t xml:space="preserve"> Xu, Wei</w:t>
-      </w:r>
-      <w:r>
-        <w:t xml:space="preserve">long Dong, </w:t>
+        <w:t xml:space="preserve"> Xu, </w:t>
       </w:r>
       <w:proofErr w:type="spellStart"/>
       <w:r>
+        <w:t>Weilong</w:t>
+      </w:r>
+      <w:proofErr w:type="spellEnd"/>
+      <w:r>
+        <w:t xml:space="preserve"> Dong, </w:t>
+      </w:r>
+      <w:proofErr w:type="spellStart"/>
+      <w:r>
         <w:t>Shuangzhi</w:t>
       </w:r>
       <w:proofErr w:type="spellEnd"/>
@@ -30825,140 +30553,67 @@
       </w:r>
       <w:proofErr w:type="spellEnd"/>
       <w:r>
-        <w:t xml:space="preserve"> Xiong. DEPN: Detecting and editing privacy neurons in pretrained language models. In </w:t>
+        <w:t xml:space="preserve"> Xiong. DEPN: Detecting and editing privacy neurons in pretrained language models. In Houda </w:t>
       </w:r>
       <w:proofErr w:type="spellStart"/>
       <w:r>
-        <w:t>Houda</w:t>
+        <w:t>Bouamor</w:t>
       </w:r>
       <w:proofErr w:type="spellEnd"/>
       <w:r>
-        <w:t xml:space="preserve"> </w:t>
+        <w:t>, Juan Pino, and Kalika Bali, editors, Proceedings of the 2023 Conference on Empirical Methods in Natural Language Processing, pages 2875–2886, Singapore, December 2023. Association for Computational Linguistics.</w:t>
+      </w:r>
+    </w:p>
+    <w:p>
+      <w:pPr>
+        <w:jc w:val="both"/>
+      </w:pPr>
+      <w:r>
+        <w:t>[14] [</w:t>
+      </w:r>
+      <w:r>
+        <w:t xml:space="preserve">Jia et al., 2024] Jinghan Jia, </w:t>
       </w:r>
       <w:proofErr w:type="spellStart"/>
       <w:r>
-        <w:t>Bouamor</w:t>
+        <w:t>Jiancheng</w:t>
       </w:r>
       <w:proofErr w:type="spellEnd"/>
       <w:r>
-        <w:t>, Juan Pino, and Kalika Bali, editors, Proceedings of the 2023 Confer</w:t>
-      </w:r>
-      <w:r>
-        <w:t/>
+        <w:t xml:space="preserve"> Liu, Yihua Zhang, Parikshit Ram, Nathalie Baracaldo, and </w:t>
       </w:r>
       <w:proofErr w:type="spellStart"/>
       <w:r>
-        <w:t>ence</w:t>
+        <w:t>Sijia</w:t>
       </w:r>
       <w:proofErr w:type="spellEnd"/>
       <w:r>
-        <w:t xml:space="preserve"> on Empirical Methods in Natural Language Processing, pages 2875–2886, Singapore, December 2023. Asso</w:t>
-      </w:r>
-      <w:r>
-        <w:t/>
+        <w:t xml:space="preserve"> Liu. WAGLE: Strategic weight attribution for effective and modular unlearning in large language models. In The Thirty</w:t>
+      </w:r>
+      <w:r>
+        <w:t>-</w:t>
+      </w:r>
+      <w:r>
+        <w:t>eighth Annual Conf</w:t>
+      </w:r>
+    </w:p>
+    <w:p>
+      <w:pPr>
+        <w:jc w:val="both"/>
+      </w:pPr>
+      <w:r>
+        <w:t xml:space="preserve">[15] </w:t>
+      </w:r>
+      <w:r>
+        <w:t xml:space="preserve">A Survey on Recommendation Unlearning: Fundamentals, Taxonomy, Evaluation, and Open Questions Yuyuan Li, Xiaohua Feng, </w:t>
       </w:r>
       <w:proofErr w:type="spellStart"/>
       <w:r>
-        <w:t>ciation</w:t>
+        <w:t>Chaochao</w:t>
       </w:r>
       <w:proofErr w:type="spellEnd"/>
       <w:r>
-        <w:t xml:space="preserve"> for Computational Linguistics.</w:t>
-      </w:r>
-    </w:p>
-    <w:p>
-      <w:pPr>
-        <w:jc w:val="both"/>
-      </w:pPr>
-      <w:r>
-        <w:t>[14] [</w:t>
-      </w:r>
-      <w:r>
-        <w:t xml:space="preserve">Jia et al., 2024] </w:t>
-      </w:r>
-      <w:proofErr w:type="spellStart"/>
-      <w:r>
-        <w:t>Jinghan</w:t>
-      </w:r>
-      <w:proofErr w:type="spellEnd"/>
-      <w:r>
-        <w:t xml:space="preserve"> Jia, </w:t>
-      </w:r>
-      <w:proofErr w:type="spellStart"/>
-      <w:r>
-        <w:t>Jiancheng</w:t>
-      </w:r>
-      <w:proofErr w:type="spellEnd"/>
-      <w:r>
-        <w:t xml:space="preserve"> Liu, </w:t>
-      </w:r>
-      <w:proofErr w:type="spellStart"/>
-      <w:r>
-        <w:t>Yihua</w:t>
-      </w:r>
-      <w:proofErr w:type="spellEnd"/>
-      <w:r>
-        <w:t xml:space="preserve"> Zhang, Parikshit Ram, Nathalie Baracaldo, and </w:t>
-      </w:r>
-      <w:proofErr w:type="spellStart"/>
-      <w:r>
-        <w:t>Sijia</w:t>
-      </w:r>
-      <w:proofErr w:type="spellEnd"/>
-      <w:r>
-        <w:t xml:space="preserve"> Liu. WA</w:t>
-      </w:r>
-      <w:r>
-        <w:t>GLE: Strategic weight attribution for effective and modular unlearning in large language models. In The Thirty</w:t>
-      </w:r>
-      <w:r>
-        <w:t>-</w:t>
-      </w:r>
-      <w:r>
-        <w:t>eighth Annual Conf</w:t>
-      </w:r>
-    </w:p>
-    <w:p>
-      <w:pPr>
-        <w:jc w:val="both"/>
-      </w:pPr>
-      <w:r>
-        <w:t xml:space="preserve">[15] </w:t>
-      </w:r>
-      <w:r>
-        <w:t xml:space="preserve">A Survey on Recommendation Unlearning: Fundamentals, Taxonomy, Evaluation, and Open Questions </w:t>
-      </w:r>
-      <w:proofErr w:type="spellStart"/>
-      <w:r>
-        <w:t>Yuyuan</w:t>
-      </w:r>
-      <w:proofErr w:type="spellEnd"/>
-      <w:r>
-        <w:t xml:space="preserve"> Li, </w:t>
-      </w:r>
-      <w:proofErr w:type="spellStart"/>
-      <w:r>
-        <w:t>Xiaohua</w:t>
-      </w:r>
-      <w:proofErr w:type="spellEnd"/>
-      <w:r>
-        <w:t xml:space="preserve"> Feng, </w:t>
-      </w:r>
-      <w:proofErr w:type="spellStart"/>
-      <w:r>
-        <w:t>Chaochao</w:t>
-      </w:r>
-      <w:proofErr w:type="spellEnd"/>
-      <w:r>
-        <w:t xml:space="preserve"> Chen*, Senior Member, IEEE, and </w:t>
-      </w:r>
-      <w:proofErr w:type="spellStart"/>
-      <w:r>
-        <w:t>Qiang</w:t>
-      </w:r>
-      <w:proofErr w:type="spellEnd"/>
-      <w:r>
-        <w:t xml:space="preserve"> Yang, Fellow, IEEE</w:t>
+        <w:t xml:space="preserve"> Chen*, Senior Member, IEEE, and Qiang Yang, Fellow, IEEE</w:t>
       </w:r>
     </w:p>
     <w:sectPr>
@@ -30973,7 +30628,7 @@
 </file>
 
 <file path=word/endnotes.xml><?xml version="1.0" encoding="utf-8"?>
-<w:endnotes xmlns:wpc="http://schemas.microsoft.com/office/word/2010/wordprocessingCanvas" xmlns:cx="http://schemas.microsoft.com/office/drawing/2014/chartex" xmlns:cx1="http://schemas.microsoft.com/office/drawing/2015/9/8/chartex" xmlns:cx2="http://schemas.microsoft.com/office/drawing/2015/10/21/chartex" xmlns:cx3="http://schemas.microsoft.com/office/drawing/2016/5/9/chartex" xmlns:cx4="http://schemas.microsoft.com/office/drawing/2016/5/10/chartex" xmlns:cx5="http://schemas.microsoft.com/office/drawing/2016/5/11/chartex" xmlns:cx6="http://schemas.microsoft.com/office/drawing/2016/5/12/chartex" xmlns:cx7="http://schemas.microsoft.com/office/drawing/2016/5/13/chartex" xmlns:cx8="http://schemas.microsoft.com/office/drawing/2016/5/14/chartex" xmlns:mc="http://schemas.openxmlformats.org/markup-compatibility/2006" xmlns:aink="http://schemas.microsoft.com/office/drawing/2016/ink" xmlns:am3d="http://schemas.microsoft.com/office/drawing/2017/model3d" xmlns:o="urn:schemas-microsoft-com:office:office" xmlns:oel="http://schemas.microsoft.com/office/2019/extlst" xmlns:r="http://schemas.openxmlformats.org/officeDocument/2006/relationships" xmlns:m="http://schemas.openxmlformats.org/officeDocument/2006/math" xmlns:v="urn:schemas-microsoft-com:vml" xmlns:wp14="http://schemas.microsoft.com/office/word/2010/wordprocessingDrawing" xmlns:wp="http://schemas.openxmlformats.org/drawingml/2006/wordprocessingDrawing" xmlns:w10="urn:schemas-microsoft-com:office:word" xmlns:w="http://schemas.openxmlformats.org/wordprocessingml/2006/main" xmlns:w14="http://schemas.microsoft.com/office/word/2010/wordml" xmlns:w15="http://schemas.microsoft.com/office/word/2012/wordml" xmlns:w16cex="http://schemas.microsoft.com/office/word/2018/wordml/cex" xmlns:w16cid="http://schemas.microsoft.com/office/word/2016/wordml/cid" xmlns:w16="http://schemas.microsoft.com/office/word/2018/wordml" xmlns:w16sdtdh="http://schemas.microsoft.com/office/word/2020/wordml/sdtdatahash" xmlns:w16se="http://schemas.microsoft.com/office/word/2015/wordml/symex" xmlns:wpg="http://schemas.microsoft.com/office/word/2010/wordprocessingGroup" xmlns:wpi="http://schemas.microsoft.com/office/word/2010/wordprocessingInk" xmlns:wne="http://schemas.microsoft.com/office/word/2006/wordml" xmlns:wps="http://schemas.microsoft.com/office/word/2010/wordprocessingShape" mc:Ignorable="w14 w15 w16se w16cid w16 w16cex w16sdtdh wp14">
+<w:endnotes xmlns:wpc="http://schemas.microsoft.com/office/word/2010/wordprocessingCanvas" xmlns:cx="http://schemas.microsoft.com/office/drawing/2014/chartex" xmlns:cx1="http://schemas.microsoft.com/office/drawing/2015/9/8/chartex" xmlns:cx2="http://schemas.microsoft.com/office/drawing/2015/10/21/chartex" xmlns:cx3="http://schemas.microsoft.com/office/drawing/2016/5/9/chartex" xmlns:cx4="http://schemas.microsoft.com/office/drawing/2016/5/10/chartex" xmlns:cx5="http://schemas.microsoft.com/office/drawing/2016/5/11/chartex" xmlns:cx6="http://schemas.microsoft.com/office/drawing/2016/5/12/chartex" xmlns:cx7="http://schemas.microsoft.com/office/drawing/2016/5/13/chartex" xmlns:cx8="http://schemas.microsoft.com/office/drawing/2016/5/14/chartex" xmlns:mc="http://schemas.openxmlformats.org/markup-compatibility/2006" xmlns:aink="http://schemas.microsoft.com/office/drawing/2016/ink" xmlns:am3d="http://schemas.microsoft.com/office/drawing/2017/model3d" xmlns:o="urn:schemas-microsoft-com:office:office" xmlns:oel="http://schemas.microsoft.com/office/2019/extlst" xmlns:r="http://schemas.openxmlformats.org/officeDocument/2006/relationships" xmlns:m="http://schemas.openxmlformats.org/officeDocument/2006/math" xmlns:v="urn:schemas-microsoft-com:vml" xmlns:wp14="http://schemas.microsoft.com/office/word/2010/wordprocessingDrawing" xmlns:wp="http://schemas.openxmlformats.org/drawingml/2006/wordprocessingDrawing" xmlns:w10="urn:schemas-microsoft-com:office:word" xmlns:w="http://schemas.openxmlformats.org/wordprocessingml/2006/main" xmlns:w14="http://schemas.microsoft.com/office/word/2010/wordml" xmlns:w15="http://schemas.microsoft.com/office/word/2012/wordml" xmlns:w16cex="http://schemas.microsoft.com/office/word/2018/wordml/cex" xmlns:w16cid="http://schemas.microsoft.com/office/word/2016/wordml/cid" xmlns:w16="http://schemas.microsoft.com/office/word/2018/wordml" xmlns:w16du="http://schemas.microsoft.com/office/word/2023/wordml/word16du" xmlns:w16sdtdh="http://schemas.microsoft.com/office/word/2020/wordml/sdtdatahash" xmlns:w16sdtfl="http://schemas.microsoft.com/office/word/2024/wordml/sdtformatlock" xmlns:w16se="http://schemas.microsoft.com/office/word/2015/wordml/symex" xmlns:wpg="http://schemas.microsoft.com/office/word/2010/wordprocessingGroup" xmlns:wpi="http://schemas.microsoft.com/office/word/2010/wordprocessingInk" xmlns:wne="http://schemas.microsoft.com/office/word/2006/wordml" xmlns:wps="http://schemas.microsoft.com/office/word/2010/wordprocessingShape" mc:Ignorable="w14 w15 w16se w16cid w16 w16cex w16sdtdh w16sdtfl w16du wp14">
   <w:endnote w:type="separator" w:id="-1">
     <w:p>
       <w:pPr>
@@ -30998,7 +30653,7 @@
 </file>
 
 <file path=word/footer1.xml><?xml version="1.0" encoding="utf-8"?>
-<w:ftr xmlns:wpc="http://schemas.microsoft.com/office/word/2010/wordprocessingCanvas" xmlns:cx="http://schemas.microsoft.com/office/drawing/2014/chartex" xmlns:cx1="http://schemas.microsoft.com/office/drawing/2015/9/8/chartex" xmlns:cx2="http://schemas.microsoft.com/office/drawing/2015/10/21/chartex" xmlns:cx3="http://schemas.microsoft.com/office/drawing/2016/5/9/chartex" xmlns:cx4="http://schemas.microsoft.com/office/drawing/2016/5/10/chartex" xmlns:cx5="http://schemas.microsoft.com/office/drawing/2016/5/11/chartex" xmlns:cx6="http://schemas.microsoft.com/office/drawing/2016/5/12/chartex" xmlns:cx7="http://schemas.microsoft.com/office/drawing/2016/5/13/chartex" xmlns:cx8="http://schemas.microsoft.com/office/drawing/2016/5/14/chartex" xmlns:mc="http://schemas.openxmlformats.org/markup-compatibility/2006" xmlns:aink="http://schemas.microsoft.com/office/drawing/2016/ink" xmlns:am3d="http://schemas.microsoft.com/office/drawing/2017/model3d" xmlns:o="urn:schemas-microsoft-com:office:office" xmlns:oel="http://schemas.microsoft.com/office/2019/extlst" xmlns:r="http://schemas.openxmlformats.org/officeDocument/2006/relationships" xmlns:m="http://schemas.openxmlformats.org/officeDocument/2006/math" xmlns:v="urn:schemas-microsoft-com:vml" xmlns:wp14="http://schemas.microsoft.com/office/word/2010/wordprocessingDrawing" xmlns:wp="http://schemas.openxmlformats.org/drawingml/2006/wordprocessingDrawing" xmlns:w10="urn:schemas-microsoft-com:office:word" xmlns:w="http://schemas.openxmlformats.org/wordprocessingml/2006/main" xmlns:w14="http://schemas.microsoft.com/office/word/2010/wordml" xmlns:w15="http://schemas.microsoft.com/office/word/2012/wordml" xmlns:w16cex="http://schemas.microsoft.com/office/word/2018/wordml/cex" xmlns:w16cid="http://schemas.microsoft.com/office/word/2016/wordml/cid" xmlns:w16="http://schemas.microsoft.com/office/word/2018/wordml" xmlns:w16sdtdh="http://schemas.microsoft.com/office/word/2020/wordml/sdtdatahash" xmlns:w16se="http://schemas.microsoft.com/office/word/2015/wordml/symex" xmlns:wpg="http://schemas.microsoft.com/office/word/2010/wordprocessingGroup" xmlns:wpi="http://schemas.microsoft.com/office/word/2010/wordprocessingInk" xmlns:wne="http://schemas.microsoft.com/office/word/2006/wordml" xmlns:wps="http://schemas.microsoft.com/office/word/2010/wordprocessingShape" mc:Ignorable="w14 w15 w16se w16cid w16 w16cex w16sdtdh wp14">
+<w:ftr xmlns:wpc="http://schemas.microsoft.com/office/word/2010/wordprocessingCanvas" xmlns:cx="http://schemas.microsoft.com/office/drawing/2014/chartex" xmlns:cx1="http://schemas.microsoft.com/office/drawing/2015/9/8/chartex" xmlns:cx2="http://schemas.microsoft.com/office/drawing/2015/10/21/chartex" xmlns:cx3="http://schemas.microsoft.com/office/drawing/2016/5/9/chartex" xmlns:cx4="http://schemas.microsoft.com/office/drawing/2016/5/10/chartex" xmlns:cx5="http://schemas.microsoft.com/office/drawing/2016/5/11/chartex" xmlns:cx6="http://schemas.microsoft.com/office/drawing/2016/5/12/chartex" xmlns:cx7="http://schemas.microsoft.com/office/drawing/2016/5/13/chartex" xmlns:cx8="http://schemas.microsoft.com/office/drawing/2016/5/14/chartex" xmlns:mc="http://schemas.openxmlformats.org/markup-compatibility/2006" xmlns:aink="http://schemas.microsoft.com/office/drawing/2016/ink" xmlns:am3d="http://schemas.microsoft.com/office/drawing/2017/model3d" xmlns:o="urn:schemas-microsoft-com:office:office" xmlns:oel="http://schemas.microsoft.com/office/2019/extlst" xmlns:r="http://schemas.openxmlformats.org/officeDocument/2006/relationships" xmlns:m="http://schemas.openxmlformats.org/officeDocument/2006/math" xmlns:v="urn:schemas-microsoft-com:vml" xmlns:wp14="http://schemas.microsoft.com/office/word/2010/wordprocessingDrawing" xmlns:wp="http://schemas.openxmlformats.org/drawingml/2006/wordprocessingDrawing" xmlns:w10="urn:schemas-microsoft-com:office:word" xmlns:w="http://schemas.openxmlformats.org/wordprocessingml/2006/main" xmlns:w14="http://schemas.microsoft.com/office/word/2010/wordml" xmlns:w15="http://schemas.microsoft.com/office/word/2012/wordml" xmlns:w16cex="http://schemas.microsoft.com/office/word/2018/wordml/cex" xmlns:w16cid="http://schemas.microsoft.com/office/word/2016/wordml/cid" xmlns:w16="http://schemas.microsoft.com/office/word/2018/wordml" xmlns:w16du="http://schemas.microsoft.com/office/word/2023/wordml/word16du" xmlns:w16sdtdh="http://schemas.microsoft.com/office/word/2020/wordml/sdtdatahash" xmlns:w16sdtfl="http://schemas.microsoft.com/office/word/2024/wordml/sdtformatlock" xmlns:w16se="http://schemas.microsoft.com/office/word/2015/wordml/symex" xmlns:wpg="http://schemas.microsoft.com/office/word/2010/wordprocessingGroup" xmlns:wpi="http://schemas.microsoft.com/office/word/2010/wordprocessingInk" xmlns:wne="http://schemas.microsoft.com/office/word/2006/wordml" xmlns:wps="http://schemas.microsoft.com/office/word/2010/wordprocessingShape" mc:Ignorable="w14 w15 w16se w16cid w16 w16cex w16sdtdh w16sdtfl w16du wp14">
   <w:sdt>
     <w:sdtPr>
       <w:id w:val="1385216498"/>
@@ -31051,7 +30706,7 @@
 </file>
 
 <file path=word/footnotes.xml><?xml version="1.0" encoding="utf-8"?>
-<w:footnotes xmlns:wpc="http://schemas.microsoft.com/office/word/2010/wordprocessingCanvas" xmlns:cx="http://schemas.microsoft.com/office/drawing/2014/chartex" xmlns:cx1="http://schemas.microsoft.com/office/drawing/2015/9/8/chartex" xmlns:cx2="http://schemas.microsoft.com/office/drawing/2015/10/21/chartex" xmlns:cx3="http://schemas.microsoft.com/office/drawing/2016/5/9/chartex" xmlns:cx4="http://schemas.microsoft.com/office/drawing/2016/5/10/chartex" xmlns:cx5="http://schemas.microsoft.com/office/drawing/2016/5/11/chartex" xmlns:cx6="http://schemas.microsoft.com/office/drawing/2016/5/12/chartex" xmlns:cx7="http://schemas.microsoft.com/office/drawing/2016/5/13/chartex" xmlns:cx8="http://schemas.microsoft.com/office/drawing/2016/5/14/chartex" xmlns:mc="http://schemas.openxmlformats.org/markup-compatibility/2006" xmlns:aink="http://schemas.microsoft.com/office/drawing/2016/ink" xmlns:am3d="http://schemas.microsoft.com/office/drawing/2017/model3d" xmlns:o="urn:schemas-microsoft-com:office:office" xmlns:oel="http://schemas.microsoft.com/office/2019/extlst" xmlns:r="http://schemas.openxmlformats.org/officeDocument/2006/relationships" xmlns:m="http://schemas.openxmlformats.org/officeDocument/2006/math" xmlns:v="urn:schemas-microsoft-com:vml" xmlns:wp14="http://schemas.microsoft.com/office/word/2010/wordprocessingDrawing" xmlns:wp="http://schemas.openxmlformats.org/drawingml/2006/wordprocessingDrawing" xmlns:w10="urn:schemas-microsoft-com:office:word" xmlns:w="http://schemas.openxmlformats.org/wordprocessingml/2006/main" xmlns:w14="http://schemas.microsoft.com/office/word/2010/wordml" xmlns:w15="http://schemas.microsoft.com/office/word/2012/wordml" xmlns:w16cex="http://schemas.microsoft.com/office/word/2018/wordml/cex" xmlns:w16cid="http://schemas.microsoft.com/office/word/2016/wordml/cid" xmlns:w16="http://schemas.microsoft.com/office/word/2018/wordml" xmlns:w16sdtdh="http://schemas.microsoft.com/office/word/2020/wordml/sdtdatahash" xmlns:w16se="http://schemas.microsoft.com/office/word/2015/wordml/symex" xmlns:wpg="http://schemas.microsoft.com/office/word/2010/wordprocessingGroup" xmlns:wpi="http://schemas.microsoft.com/office/word/2010/wordprocessingInk" xmlns:wne="http://schemas.microsoft.com/office/word/2006/wordml" xmlns:wps="http://schemas.microsoft.com/office/word/2010/wordprocessingShape" mc:Ignorable="w14 w15 w16se w16cid w16 w16cex w16sdtdh wp14">
+<w:footnotes xmlns:wpc="http://schemas.microsoft.com/office/word/2010/wordprocessingCanvas" xmlns:cx="http://schemas.microsoft.com/office/drawing/2014/chartex" xmlns:cx1="http://schemas.microsoft.com/office/drawing/2015/9/8/chartex" xmlns:cx2="http://schemas.microsoft.com/office/drawing/2015/10/21/chartex" xmlns:cx3="http://schemas.microsoft.com/office/drawing/2016/5/9/chartex" xmlns:cx4="http://schemas.microsoft.com/office/drawing/2016/5/10/chartex" xmlns:cx5="http://schemas.microsoft.com/office/drawing/2016/5/11/chartex" xmlns:cx6="http://schemas.microsoft.com/office/drawing/2016/5/12/chartex" xmlns:cx7="http://schemas.microsoft.com/office/drawing/2016/5/13/chartex" xmlns:cx8="http://schemas.microsoft.com/office/drawing/2016/5/14/chartex" xmlns:mc="http://schemas.openxmlformats.org/markup-compatibility/2006" xmlns:aink="http://schemas.microsoft.com/office/drawing/2016/ink" xmlns:am3d="http://schemas.microsoft.com/office/drawing/2017/model3d" xmlns:o="urn:schemas-microsoft-com:office:office" xmlns:oel="http://schemas.microsoft.com/office/2019/extlst" xmlns:r="http://schemas.openxmlformats.org/officeDocument/2006/relationships" xmlns:m="http://schemas.openxmlformats.org/officeDocument/2006/math" xmlns:v="urn:schemas-microsoft-com:vml" xmlns:wp14="http://schemas.microsoft.com/office/word/2010/wordprocessingDrawing" xmlns:wp="http://schemas.openxmlformats.org/drawingml/2006/wordprocessingDrawing" xmlns:w10="urn:schemas-microsoft-com:office:word" xmlns:w="http://schemas.openxmlformats.org/wordprocessingml/2006/main" xmlns:w14="http://schemas.microsoft.com/office/word/2010/wordml" xmlns:w15="http://schemas.microsoft.com/office/word/2012/wordml" xmlns:w16cex="http://schemas.microsoft.com/office/word/2018/wordml/cex" xmlns:w16cid="http://schemas.microsoft.com/office/word/2016/wordml/cid" xmlns:w16="http://schemas.microsoft.com/office/word/2018/wordml" xmlns:w16du="http://schemas.microsoft.com/office/word/2023/wordml/word16du" xmlns:w16sdtdh="http://schemas.microsoft.com/office/word/2020/wordml/sdtdatahash" xmlns:w16sdtfl="http://schemas.microsoft.com/office/word/2024/wordml/sdtformatlock" xmlns:w16se="http://schemas.microsoft.com/office/word/2015/wordml/symex" xmlns:wpg="http://schemas.microsoft.com/office/word/2010/wordprocessingGroup" xmlns:wpi="http://schemas.microsoft.com/office/word/2010/wordprocessingInk" xmlns:wne="http://schemas.microsoft.com/office/word/2006/wordml" xmlns:wps="http://schemas.microsoft.com/office/word/2010/wordprocessingShape" mc:Ignorable="w14 w15 w16se w16cid w16 w16cex w16sdtdh w16sdtfl w16du wp14">
   <w:footnote w:type="separator" w:id="-1">
     <w:p>
       <w:pPr>
@@ -31076,7 +30731,7 @@
 </file>
 
 <file path=word/numbering.xml><?xml version="1.0" encoding="utf-8"?>
-<w:numbering xmlns:wpc="http://schemas.microsoft.com/office/word/2010/wordprocessingCanvas" xmlns:cx="http://schemas.microsoft.com/office/drawing/2014/chartex" xmlns:cx1="http://schemas.microsoft.com/office/drawing/2015/9/8/chartex" xmlns:cx2="http://schemas.microsoft.com/office/drawing/2015/10/21/chartex" xmlns:cx3="http://schemas.microsoft.com/office/drawing/2016/5/9/chartex" xmlns:cx4="http://schemas.microsoft.com/office/drawing/2016/5/10/chartex" xmlns:cx5="http://schemas.microsoft.com/office/drawing/2016/5/11/chartex" xmlns:cx6="http://schemas.microsoft.com/office/drawing/2016/5/12/chartex" xmlns:cx7="http://schemas.microsoft.com/office/drawing/2016/5/13/chartex" xmlns:cx8="http://schemas.microsoft.com/office/drawing/2016/5/14/chartex" xmlns:mc="http://schemas.openxmlformats.org/markup-compatibility/2006" xmlns:aink="http://schemas.microsoft.com/office/drawing/2016/ink" xmlns:am3d="http://schemas.microsoft.com/office/drawing/2017/model3d" xmlns:o="urn:schemas-microsoft-com:office:office" xmlns:oel="http://schemas.microsoft.com/office/2019/extlst" xmlns:r="http://schemas.openxmlformats.org/officeDocument/2006/relationships" xmlns:m="http://schemas.openxmlformats.org/officeDocument/2006/math" xmlns:v="urn:schemas-microsoft-com:vml" xmlns:wp14="http://schemas.microsoft.com/office/word/2010/wordprocessingDrawing" xmlns:wp="http://schemas.openxmlformats.org/drawingml/2006/wordprocessingDrawing" xmlns:w10="urn:schemas-microsoft-com:office:word" xmlns:w="http://schemas.openxmlformats.org/wordprocessingml/2006/main" xmlns:w14="http://schemas.microsoft.com/office/word/2010/wordml" xmlns:w15="http://schemas.microsoft.com/office/word/2012/wordml" xmlns:w16cex="http://schemas.microsoft.com/office/word/2018/wordml/cex" xmlns:w16cid="http://schemas.microsoft.com/office/word/2016/wordml/cid" xmlns:w16="http://schemas.microsoft.com/office/word/2018/wordml" xmlns:w16sdtdh="http://schemas.microsoft.com/office/word/2020/wordml/sdtdatahash" xmlns:w16se="http://schemas.microsoft.com/office/word/2015/wordml/symex" xmlns:wpg="http://schemas.microsoft.com/office/word/2010/wordprocessingGroup" xmlns:wpi="http://schemas.microsoft.com/office/word/2010/wordprocessingInk" xmlns:wne="http://schemas.microsoft.com/office/word/2006/wordml" xmlns:wps="http://schemas.microsoft.com/office/word/2010/wordprocessingShape" mc:Ignorable="w14 w15 w16se w16cid w16 w16cex w16sdtdh wp14">
+<w:numbering xmlns:wpc="http://schemas.microsoft.com/office/word/2010/wordprocessingCanvas" xmlns:cx="http://schemas.microsoft.com/office/drawing/2014/chartex" xmlns:cx1="http://schemas.microsoft.com/office/drawing/2015/9/8/chartex" xmlns:cx2="http://schemas.microsoft.com/office/drawing/2015/10/21/chartex" xmlns:cx3="http://schemas.microsoft.com/office/drawing/2016/5/9/chartex" xmlns:cx4="http://schemas.microsoft.com/office/drawing/2016/5/10/chartex" xmlns:cx5="http://schemas.microsoft.com/office/drawing/2016/5/11/chartex" xmlns:cx6="http://schemas.microsoft.com/office/drawing/2016/5/12/chartex" xmlns:cx7="http://schemas.microsoft.com/office/drawing/2016/5/13/chartex" xmlns:cx8="http://schemas.microsoft.com/office/drawing/2016/5/14/chartex" xmlns:mc="http://schemas.openxmlformats.org/markup-compatibility/2006" xmlns:aink="http://schemas.microsoft.com/office/drawing/2016/ink" xmlns:am3d="http://schemas.microsoft.com/office/drawing/2017/model3d" xmlns:o="urn:schemas-microsoft-com:office:office" xmlns:oel="http://schemas.microsoft.com/office/2019/extlst" xmlns:r="http://schemas.openxmlformats.org/officeDocument/2006/relationships" xmlns:m="http://schemas.openxmlformats.org/officeDocument/2006/math" xmlns:v="urn:schemas-microsoft-com:vml" xmlns:wp14="http://schemas.microsoft.com/office/word/2010/wordprocessingDrawing" xmlns:wp="http://schemas.openxmlformats.org/drawingml/2006/wordprocessingDrawing" xmlns:w10="urn:schemas-microsoft-com:office:word" xmlns:w="http://schemas.openxmlformats.org/wordprocessingml/2006/main" xmlns:w14="http://schemas.microsoft.com/office/word/2010/wordml" xmlns:w15="http://schemas.microsoft.com/office/word/2012/wordml" xmlns:w16cex="http://schemas.microsoft.com/office/word/2018/wordml/cex" xmlns:w16cid="http://schemas.microsoft.com/office/word/2016/wordml/cid" xmlns:w16="http://schemas.microsoft.com/office/word/2018/wordml" xmlns:w16du="http://schemas.microsoft.com/office/word/2023/wordml/word16du" xmlns:w16sdtdh="http://schemas.microsoft.com/office/word/2020/wordml/sdtdatahash" xmlns:w16sdtfl="http://schemas.microsoft.com/office/word/2024/wordml/sdtformatlock" xmlns:w16se="http://schemas.microsoft.com/office/word/2015/wordml/symex" xmlns:wpg="http://schemas.microsoft.com/office/word/2010/wordprocessingGroup" xmlns:wpi="http://schemas.microsoft.com/office/word/2010/wordprocessingInk" xmlns:wne="http://schemas.microsoft.com/office/word/2006/wordml" xmlns:wps="http://schemas.microsoft.com/office/word/2010/wordprocessingShape" mc:Ignorable="w14 w15 w16se w16cid w16 w16cex w16sdtdh w16sdtfl w16du wp14">
   <w:abstractNum w:abstractNumId="0" w15:restartNumberingAfterBreak="0">
     <w:nsid w:val="00E635E9"/>
     <w:multiLevelType w:val="multilevel"/>
@@ -38921,7 +38576,7 @@
 </file>
 
 <file path=word/styles.xml><?xml version="1.0" encoding="utf-8"?>
-<w:styles xmlns:mc="http://schemas.openxmlformats.org/markup-compatibility/2006" xmlns:r="http://schemas.openxmlformats.org/officeDocument/2006/relationships" xmlns:w="http://schemas.openxmlformats.org/wordprocessingml/2006/main" xmlns:w14="http://schemas.microsoft.com/office/word/2010/wordml" xmlns:w15="http://schemas.microsoft.com/office/word/2012/wordml" xmlns:w16cex="http://schemas.microsoft.com/office/word/2018/wordml/cex" xmlns:w16cid="http://schemas.microsoft.com/office/word/2016/wordml/cid" xmlns:w16="http://schemas.microsoft.com/office/word/2018/wordml" xmlns:w16sdtdh="http://schemas.microsoft.com/office/word/2020/wordml/sdtdatahash" xmlns:w16se="http://schemas.microsoft.com/office/word/2015/wordml/symex" mc:Ignorable="w14 w15 w16se w16cid w16 w16cex w16sdtdh">
+<w:styles xmlns:mc="http://schemas.openxmlformats.org/markup-compatibility/2006" xmlns:r="http://schemas.openxmlformats.org/officeDocument/2006/relationships" xmlns:w="http://schemas.openxmlformats.org/wordprocessingml/2006/main" xmlns:w14="http://schemas.microsoft.com/office/word/2010/wordml" xmlns:w15="http://schemas.microsoft.com/office/word/2012/wordml" xmlns:w16cex="http://schemas.microsoft.com/office/word/2018/wordml/cex" xmlns:w16cid="http://schemas.microsoft.com/office/word/2016/wordml/cid" xmlns:w16="http://schemas.microsoft.com/office/word/2018/wordml" xmlns:w16du="http://schemas.microsoft.com/office/word/2023/wordml/word16du" xmlns:w16sdtdh="http://schemas.microsoft.com/office/word/2020/wordml/sdtdatahash" xmlns:w16sdtfl="http://schemas.microsoft.com/office/word/2024/wordml/sdtformatlock" xmlns:w16se="http://schemas.microsoft.com/office/word/2015/wordml/symex" mc:Ignorable="w14 w15 w16se w16cid w16 w16cex w16sdtdh w16sdtfl w16du">
   <w:docDefaults>
     <w:rPrDefault>
       <w:rPr>
@@ -39520,6 +39175,7 @@
   <w:style w:type="character" w:default="1" w:styleId="DefaultParagraphFont">
     <w:name w:val="Default Paragraph Font"/>
     <w:uiPriority w:val="1"/>
+    <w:semiHidden/>
     <w:unhideWhenUsed/>
   </w:style>
   <w:style w:type="table" w:default="1" w:styleId="TableNormal">

</xml_diff>